<commit_message>
#14 - Hero section added
</commit_message>
<xml_diff>
--- a/myprofiledoc.docx
+++ b/myprofiledoc.docx
@@ -24,7 +24,6 @@
           <w:szCs w:val="28"/>
         </w:rPr>
       </w:pPr>
-      <w:proofErr w:type="spellStart"/>
       <w:proofErr w:type="gramStart"/>
       <w:r>
         <w:rPr>
@@ -33,7 +32,6 @@
         </w:rPr>
         <w:t>npm</w:t>
       </w:r>
-      <w:proofErr w:type="spellEnd"/>
       <w:proofErr w:type="gramEnd"/>
       <w:r>
         <w:rPr>
@@ -475,147 +473,170 @@
           <w:szCs w:val="28"/>
         </w:rPr>
         <w:t>: [</w:t>
+      </w:r>
+    </w:p>
+    <w:p>
+      <w:pPr>
+        <w:rPr>
+          <w:sz w:val="28"/>
+          <w:szCs w:val="28"/>
+        </w:rPr>
+      </w:pPr>
+      <w:r>
+        <w:rPr>
+          <w:sz w:val="28"/>
+          <w:szCs w:val="28"/>
+        </w:rPr>
+        <w:t xml:space="preserve">    </w:t>
+      </w:r>
+      <w:proofErr w:type="spellStart"/>
+      <w:proofErr w:type="gramStart"/>
+      <w:r>
+        <w:rPr>
+          <w:sz w:val="28"/>
+          <w:szCs w:val="28"/>
+        </w:rPr>
+        <w:t>tailwindcss</w:t>
+      </w:r>
+      <w:proofErr w:type="spellEnd"/>
+      <w:r>
+        <w:rPr>
+          <w:sz w:val="28"/>
+          <w:szCs w:val="28"/>
+        </w:rPr>
+        <w:t>(</w:t>
+      </w:r>
+      <w:proofErr w:type="gramEnd"/>
+      <w:r>
+        <w:rPr>
+          <w:sz w:val="28"/>
+          <w:szCs w:val="28"/>
+        </w:rPr>
+        <w:t>),</w:t>
+      </w:r>
+    </w:p>
+    <w:p>
+      <w:pPr>
+        <w:rPr>
+          <w:sz w:val="28"/>
+          <w:szCs w:val="28"/>
+        </w:rPr>
+      </w:pPr>
+      <w:r>
+        <w:rPr>
+          <w:sz w:val="28"/>
+          <w:szCs w:val="28"/>
+        </w:rPr>
+        <w:t xml:space="preserve">  ],</w:t>
+      </w:r>
+    </w:p>
+    <w:p>
+      <w:pPr>
+        <w:rPr>
+          <w:sz w:val="28"/>
+          <w:szCs w:val="28"/>
+        </w:rPr>
+      </w:pPr>
+      <w:r>
+        <w:rPr>
+          <w:sz w:val="28"/>
+          <w:szCs w:val="28"/>
+        </w:rPr>
+        <w:t>})</w:t>
+      </w:r>
+    </w:p>
+    <w:p>
+      <w:pPr>
+        <w:rPr>
+          <w:sz w:val="28"/>
+          <w:szCs w:val="28"/>
+          <w:u w:val="single"/>
+        </w:rPr>
+      </w:pPr>
+      <w:proofErr w:type="gramStart"/>
+      <w:r>
+        <w:rPr>
+          <w:sz w:val="28"/>
+          <w:szCs w:val="28"/>
+          <w:u w:val="single"/>
+        </w:rPr>
+        <w:t>import</w:t>
+      </w:r>
+      <w:proofErr w:type="gramEnd"/>
+      <w:r>
+        <w:rPr>
+          <w:sz w:val="28"/>
+          <w:szCs w:val="28"/>
+          <w:u w:val="single"/>
+        </w:rPr>
+        <w:t xml:space="preserve"> </w:t>
+      </w:r>
+      <w:proofErr w:type="spellStart"/>
+      <w:r>
+        <w:rPr>
+          <w:sz w:val="28"/>
+          <w:szCs w:val="28"/>
+          <w:u w:val="single"/>
+        </w:rPr>
+        <w:t>css</w:t>
+      </w:r>
+      <w:proofErr w:type="spellEnd"/>
+    </w:p>
+    <w:p>
+      <w:pPr>
+        <w:rPr>
+          <w:sz w:val="28"/>
+          <w:szCs w:val="28"/>
+        </w:rPr>
+      </w:pPr>
+      <w:r>
+        <w:rPr>
+          <w:sz w:val="28"/>
+          <w:szCs w:val="28"/>
+        </w:rPr>
+        <w:t>@import "</w:t>
+      </w:r>
+      <w:proofErr w:type="spellStart"/>
+      <w:r>
+        <w:rPr>
+          <w:sz w:val="28"/>
+          <w:szCs w:val="28"/>
+        </w:rPr>
+        <w:t>tailwindcss</w:t>
+      </w:r>
+      <w:proofErr w:type="spellEnd"/>
+      <w:r>
+        <w:rPr>
+          <w:sz w:val="28"/>
+          <w:szCs w:val="28"/>
+        </w:rPr>
+        <w:t>";</w:t>
+      </w:r>
+    </w:p>
+    <w:p>
+      <w:pPr>
+        <w:rPr>
+          <w:sz w:val="28"/>
+          <w:szCs w:val="28"/>
+        </w:rPr>
+      </w:pPr>
+    </w:p>
+    <w:p>
+      <w:pPr>
+        <w:rPr>
+          <w:sz w:val="28"/>
+          <w:szCs w:val="28"/>
+        </w:rPr>
+      </w:pPr>
+      <w:r>
+        <w:rPr>
+          <w:sz w:val="28"/>
+          <w:szCs w:val="28"/>
+        </w:rPr>
+        <w:t>https://dribbble.com/shots/17602739-Personal-Portfolio-Resume-Landing-Page</w:t>
       </w:r>
       <w:bookmarkStart w:id="0" w:name="_GoBack"/>
       <w:bookmarkEnd w:id="0"/>
-    </w:p>
-    <w:p>
-      <w:pPr>
-        <w:rPr>
-          <w:sz w:val="28"/>
-          <w:szCs w:val="28"/>
-        </w:rPr>
-      </w:pPr>
-      <w:r>
-        <w:rPr>
-          <w:sz w:val="28"/>
-          <w:szCs w:val="28"/>
-        </w:rPr>
-        <w:t xml:space="preserve">    </w:t>
-      </w:r>
-      <w:proofErr w:type="spellStart"/>
-      <w:proofErr w:type="gramStart"/>
-      <w:r>
-        <w:rPr>
-          <w:sz w:val="28"/>
-          <w:szCs w:val="28"/>
-        </w:rPr>
-        <w:t>tailwindcss</w:t>
-      </w:r>
-      <w:proofErr w:type="spellEnd"/>
-      <w:r>
-        <w:rPr>
-          <w:sz w:val="28"/>
-          <w:szCs w:val="28"/>
-        </w:rPr>
-        <w:t>(</w:t>
-      </w:r>
-      <w:proofErr w:type="gramEnd"/>
-      <w:r>
-        <w:rPr>
-          <w:sz w:val="28"/>
-          <w:szCs w:val="28"/>
-        </w:rPr>
-        <w:t>),</w:t>
-      </w:r>
-    </w:p>
-    <w:p>
-      <w:pPr>
-        <w:rPr>
-          <w:sz w:val="28"/>
-          <w:szCs w:val="28"/>
-        </w:rPr>
-      </w:pPr>
-      <w:r>
-        <w:rPr>
-          <w:sz w:val="28"/>
-          <w:szCs w:val="28"/>
-        </w:rPr>
-        <w:t xml:space="preserve">  ],</w:t>
-      </w:r>
-    </w:p>
-    <w:p>
-      <w:pPr>
-        <w:rPr>
-          <w:sz w:val="28"/>
-          <w:szCs w:val="28"/>
-        </w:rPr>
-      </w:pPr>
-      <w:r>
-        <w:rPr>
-          <w:sz w:val="28"/>
-          <w:szCs w:val="28"/>
-        </w:rPr>
-        <w:t>})</w:t>
-      </w:r>
-    </w:p>
-    <w:p>
-      <w:pPr>
-        <w:rPr>
-          <w:sz w:val="28"/>
-          <w:szCs w:val="28"/>
-          <w:u w:val="single"/>
-        </w:rPr>
-      </w:pPr>
-      <w:proofErr w:type="gramStart"/>
-      <w:r>
-        <w:rPr>
-          <w:sz w:val="28"/>
-          <w:szCs w:val="28"/>
-          <w:u w:val="single"/>
-        </w:rPr>
-        <w:t>import</w:t>
-      </w:r>
-      <w:proofErr w:type="gramEnd"/>
-      <w:r>
-        <w:rPr>
-          <w:sz w:val="28"/>
-          <w:szCs w:val="28"/>
-          <w:u w:val="single"/>
-        </w:rPr>
-        <w:t xml:space="preserve"> </w:t>
-      </w:r>
-      <w:proofErr w:type="spellStart"/>
-      <w:r>
-        <w:rPr>
-          <w:sz w:val="28"/>
-          <w:szCs w:val="28"/>
-          <w:u w:val="single"/>
-        </w:rPr>
-        <w:t>css</w:t>
-      </w:r>
-      <w:proofErr w:type="spellEnd"/>
-    </w:p>
-    <w:p>
-      <w:pPr>
-        <w:rPr>
-          <w:sz w:val="28"/>
-          <w:szCs w:val="28"/>
-        </w:rPr>
-      </w:pPr>
-      <w:r>
-        <w:rPr>
-          <w:sz w:val="28"/>
-          <w:szCs w:val="28"/>
-        </w:rPr>
-        <w:t>@import "</w:t>
-      </w:r>
-      <w:proofErr w:type="spellStart"/>
-      <w:r>
-        <w:rPr>
-          <w:sz w:val="28"/>
-          <w:szCs w:val="28"/>
-        </w:rPr>
-        <w:t>tailwindcss</w:t>
-      </w:r>
-      <w:proofErr w:type="spellEnd"/>
-      <w:r>
-        <w:rPr>
-          <w:sz w:val="28"/>
-          <w:szCs w:val="28"/>
-        </w:rPr>
-        <w:t>";</w:t>
-      </w:r>
     </w:p>
     <w:p>
       <w:pPr>

</xml_diff>

<commit_message>
Issue-1 - Social section fix
</commit_message>
<xml_diff>
--- a/myprofiledoc.docx
+++ b/myprofiledoc.docx
@@ -38,26 +38,16 @@
           <w:sz w:val="28"/>
           <w:szCs w:val="28"/>
         </w:rPr>
-        <w:t xml:space="preserve"> create </w:t>
-      </w:r>
-      <w:proofErr w:type="spellStart"/>
-      <w:r>
-        <w:rPr>
-          <w:sz w:val="28"/>
-          <w:szCs w:val="28"/>
-        </w:rPr>
-        <w:t>vite@latest</w:t>
-      </w:r>
-      <w:proofErr w:type="spellEnd"/>
-    </w:p>
-    <w:p>
-      <w:pPr>
-        <w:rPr>
-          <w:sz w:val="28"/>
-          <w:szCs w:val="28"/>
-        </w:rPr>
-      </w:pPr>
-      <w:proofErr w:type="spellStart"/>
+        <w:t xml:space="preserve"> create vite@latest</w:t>
+      </w:r>
+    </w:p>
+    <w:p>
+      <w:pPr>
+        <w:rPr>
+          <w:sz w:val="28"/>
+          <w:szCs w:val="28"/>
+        </w:rPr>
+      </w:pPr>
       <w:proofErr w:type="gramStart"/>
       <w:r>
         <w:rPr>
@@ -66,7 +56,6 @@
         </w:rPr>
         <w:t>npm</w:t>
       </w:r>
-      <w:proofErr w:type="spellEnd"/>
       <w:proofErr w:type="gramEnd"/>
       <w:r>
         <w:rPr>
@@ -96,26 +85,16 @@
           <w:sz w:val="28"/>
           <w:szCs w:val="28"/>
         </w:rPr>
-        <w:t xml:space="preserve">Install tailwind </w:t>
-      </w:r>
-      <w:proofErr w:type="spellStart"/>
-      <w:r>
-        <w:rPr>
-          <w:sz w:val="28"/>
-          <w:szCs w:val="28"/>
-        </w:rPr>
-        <w:t>css</w:t>
-      </w:r>
-      <w:proofErr w:type="spellEnd"/>
-    </w:p>
-    <w:p>
-      <w:pPr>
-        <w:rPr>
-          <w:sz w:val="28"/>
-          <w:szCs w:val="28"/>
-        </w:rPr>
-      </w:pPr>
-      <w:proofErr w:type="spellStart"/>
+        <w:t>Install tailwind css</w:t>
+      </w:r>
+    </w:p>
+    <w:p>
+      <w:pPr>
+        <w:rPr>
+          <w:sz w:val="28"/>
+          <w:szCs w:val="28"/>
+        </w:rPr>
+      </w:pPr>
       <w:proofErr w:type="gramStart"/>
       <w:r>
         <w:rPr>
@@ -124,24 +103,31 @@
         </w:rPr>
         <w:t>npm</w:t>
       </w:r>
-      <w:proofErr w:type="spellEnd"/>
-      <w:proofErr w:type="gramEnd"/>
-      <w:r>
-        <w:rPr>
-          <w:sz w:val="28"/>
-          <w:szCs w:val="28"/>
-        </w:rPr>
-        <w:t xml:space="preserve"> create </w:t>
-      </w:r>
-      <w:proofErr w:type="spellStart"/>
-      <w:r>
-        <w:rPr>
-          <w:sz w:val="28"/>
-          <w:szCs w:val="28"/>
-        </w:rPr>
-        <w:t>vite@latest</w:t>
-      </w:r>
-      <w:proofErr w:type="spellEnd"/>
+      <w:proofErr w:type="gramEnd"/>
+      <w:r>
+        <w:rPr>
+          <w:sz w:val="28"/>
+          <w:szCs w:val="28"/>
+        </w:rPr>
+        <w:t xml:space="preserve"> create vite@latest my-project</w:t>
+      </w:r>
+    </w:p>
+    <w:p>
+      <w:pPr>
+        <w:rPr>
+          <w:sz w:val="28"/>
+          <w:szCs w:val="28"/>
+        </w:rPr>
+      </w:pPr>
+      <w:proofErr w:type="gramStart"/>
+      <w:r>
+        <w:rPr>
+          <w:sz w:val="28"/>
+          <w:szCs w:val="28"/>
+        </w:rPr>
+        <w:t>cd</w:t>
+      </w:r>
+      <w:proofErr w:type="gramEnd"/>
       <w:r>
         <w:rPr>
           <w:sz w:val="28"/>
@@ -163,83 +149,16 @@
           <w:sz w:val="28"/>
           <w:szCs w:val="28"/>
         </w:rPr>
-        <w:t>cd</w:t>
-      </w:r>
-      <w:proofErr w:type="gramEnd"/>
-      <w:r>
-        <w:rPr>
-          <w:sz w:val="28"/>
-          <w:szCs w:val="28"/>
-        </w:rPr>
-        <w:t xml:space="preserve"> my-project</w:t>
-      </w:r>
-    </w:p>
-    <w:p>
-      <w:pPr>
-        <w:rPr>
-          <w:sz w:val="28"/>
-          <w:szCs w:val="28"/>
-        </w:rPr>
-      </w:pPr>
-      <w:proofErr w:type="spellStart"/>
-      <w:proofErr w:type="gramStart"/>
-      <w:r>
-        <w:rPr>
-          <w:sz w:val="28"/>
-          <w:szCs w:val="28"/>
-        </w:rPr>
         <w:t>npm</w:t>
       </w:r>
-      <w:proofErr w:type="spellEnd"/>
-      <w:proofErr w:type="gramEnd"/>
-      <w:r>
-        <w:rPr>
-          <w:sz w:val="28"/>
-          <w:szCs w:val="28"/>
-        </w:rPr>
-        <w:t xml:space="preserve"> install </w:t>
-      </w:r>
-      <w:proofErr w:type="spellStart"/>
-      <w:r>
-        <w:rPr>
-          <w:sz w:val="28"/>
-          <w:szCs w:val="28"/>
-        </w:rPr>
-        <w:t>tailwindcss</w:t>
-      </w:r>
-      <w:proofErr w:type="spellEnd"/>
-      <w:r>
-        <w:rPr>
-          <w:sz w:val="28"/>
-          <w:szCs w:val="28"/>
-        </w:rPr>
-        <w:t xml:space="preserve"> @</w:t>
-      </w:r>
-      <w:proofErr w:type="spellStart"/>
-      <w:r>
-        <w:rPr>
-          <w:sz w:val="28"/>
-          <w:szCs w:val="28"/>
-        </w:rPr>
-        <w:t>tailwindcss</w:t>
-      </w:r>
-      <w:proofErr w:type="spellEnd"/>
-      <w:r>
-        <w:rPr>
-          <w:sz w:val="28"/>
-          <w:szCs w:val="28"/>
-        </w:rPr>
-        <w:t>/</w:t>
-      </w:r>
-      <w:proofErr w:type="spellStart"/>
-      <w:r>
-        <w:rPr>
-          <w:sz w:val="28"/>
-          <w:szCs w:val="28"/>
-        </w:rPr>
-        <w:t>vite</w:t>
-      </w:r>
-      <w:proofErr w:type="spellEnd"/>
+      <w:proofErr w:type="gramEnd"/>
+      <w:r>
+        <w:rPr>
+          <w:sz w:val="28"/>
+          <w:szCs w:val="28"/>
+        </w:rPr>
+        <w:t xml:space="preserve"> install tailwindcss @tailwindcss/vite</w:t>
+      </w:r>
     </w:p>
     <w:p>
       <w:pPr>
@@ -257,7 +176,6 @@
           <w:u w:val="single"/>
         </w:rPr>
       </w:pPr>
-      <w:proofErr w:type="spellStart"/>
       <w:r>
         <w:rPr>
           <w:sz w:val="28"/>
@@ -266,7 +184,6 @@
         </w:rPr>
         <w:t>vite.config.ts</w:t>
       </w:r>
-      <w:proofErr w:type="spellEnd"/>
     </w:p>
     <w:p>
       <w:pPr>
@@ -289,39 +206,7 @@
           <w:sz w:val="28"/>
           <w:szCs w:val="28"/>
         </w:rPr>
-        <w:t xml:space="preserve"> { </w:t>
-      </w:r>
-      <w:proofErr w:type="spellStart"/>
-      <w:r>
-        <w:rPr>
-          <w:sz w:val="28"/>
-          <w:szCs w:val="28"/>
-        </w:rPr>
-        <w:t>defineConfig</w:t>
-      </w:r>
-      <w:proofErr w:type="spellEnd"/>
-      <w:r>
-        <w:rPr>
-          <w:sz w:val="28"/>
-          <w:szCs w:val="28"/>
-        </w:rPr>
-        <w:t xml:space="preserve"> } from '</w:t>
-      </w:r>
-      <w:proofErr w:type="spellStart"/>
-      <w:r>
-        <w:rPr>
-          <w:sz w:val="28"/>
-          <w:szCs w:val="28"/>
-        </w:rPr>
-        <w:t>vite</w:t>
-      </w:r>
-      <w:proofErr w:type="spellEnd"/>
-      <w:r>
-        <w:rPr>
-          <w:sz w:val="28"/>
-          <w:szCs w:val="28"/>
-        </w:rPr>
-        <w:t>'</w:t>
+        <w:t xml:space="preserve"> { defineConfig } from 'vite'</w:t>
       </w:r>
     </w:p>
     <w:p>
@@ -345,55 +230,7 @@
           <w:sz w:val="28"/>
           <w:szCs w:val="28"/>
         </w:rPr>
-        <w:t xml:space="preserve"> </w:t>
-      </w:r>
-      <w:proofErr w:type="spellStart"/>
-      <w:r>
-        <w:rPr>
-          <w:sz w:val="28"/>
-          <w:szCs w:val="28"/>
-        </w:rPr>
-        <w:t>tailwindcss</w:t>
-      </w:r>
-      <w:proofErr w:type="spellEnd"/>
-      <w:r>
-        <w:rPr>
-          <w:sz w:val="28"/>
-          <w:szCs w:val="28"/>
-        </w:rPr>
-        <w:t xml:space="preserve"> from '@</w:t>
-      </w:r>
-      <w:proofErr w:type="spellStart"/>
-      <w:r>
-        <w:rPr>
-          <w:sz w:val="28"/>
-          <w:szCs w:val="28"/>
-        </w:rPr>
-        <w:t>tailwindcss</w:t>
-      </w:r>
-      <w:proofErr w:type="spellEnd"/>
-      <w:r>
-        <w:rPr>
-          <w:sz w:val="28"/>
-          <w:szCs w:val="28"/>
-        </w:rPr>
-        <w:t>/</w:t>
-      </w:r>
-      <w:proofErr w:type="spellStart"/>
-      <w:r>
-        <w:rPr>
-          <w:sz w:val="28"/>
-          <w:szCs w:val="28"/>
-        </w:rPr>
-        <w:t>vite</w:t>
-      </w:r>
-      <w:proofErr w:type="spellEnd"/>
-      <w:r>
-        <w:rPr>
-          <w:sz w:val="28"/>
-          <w:szCs w:val="28"/>
-        </w:rPr>
-        <w:t>'</w:t>
+        <w:t xml:space="preserve"> tailwindcss from '@tailwindcss/vite'</w:t>
       </w:r>
     </w:p>
     <w:p>
@@ -425,23 +262,7 @@
           <w:sz w:val="28"/>
           <w:szCs w:val="28"/>
         </w:rPr>
-        <w:t xml:space="preserve"> default </w:t>
-      </w:r>
-      <w:proofErr w:type="spellStart"/>
-      <w:r>
-        <w:rPr>
-          <w:sz w:val="28"/>
-          <w:szCs w:val="28"/>
-        </w:rPr>
-        <w:t>defineConfig</w:t>
-      </w:r>
-      <w:proofErr w:type="spellEnd"/>
-      <w:r>
-        <w:rPr>
-          <w:sz w:val="28"/>
-          <w:szCs w:val="28"/>
-        </w:rPr>
-        <w:t>({</w:t>
+        <w:t xml:space="preserve"> default defineConfig({</w:t>
       </w:r>
     </w:p>
     <w:p>
@@ -489,22 +310,13 @@
         </w:rPr>
         <w:t xml:space="preserve">    </w:t>
       </w:r>
-      <w:proofErr w:type="spellStart"/>
-      <w:proofErr w:type="gramStart"/>
-      <w:r>
-        <w:rPr>
-          <w:sz w:val="28"/>
-          <w:szCs w:val="28"/>
-        </w:rPr>
-        <w:t>tailwindcss</w:t>
-      </w:r>
-      <w:proofErr w:type="spellEnd"/>
-      <w:r>
-        <w:rPr>
-          <w:sz w:val="28"/>
-          <w:szCs w:val="28"/>
-        </w:rPr>
-        <w:t>(</w:t>
+      <w:proofErr w:type="gramStart"/>
+      <w:r>
+        <w:rPr>
+          <w:sz w:val="28"/>
+          <w:szCs w:val="28"/>
+        </w:rPr>
+        <w:t>tailwindcss(</w:t>
       </w:r>
       <w:proofErr w:type="gramEnd"/>
       <w:r>
@@ -569,74 +381,214 @@
           <w:szCs w:val="28"/>
           <w:u w:val="single"/>
         </w:rPr>
-        <w:t xml:space="preserve"> </w:t>
-      </w:r>
-      <w:proofErr w:type="spellStart"/>
-      <w:r>
-        <w:rPr>
-          <w:sz w:val="28"/>
-          <w:szCs w:val="28"/>
-          <w:u w:val="single"/>
-        </w:rPr>
-        <w:t>css</w:t>
-      </w:r>
-      <w:proofErr w:type="spellEnd"/>
-    </w:p>
-    <w:p>
-      <w:pPr>
-        <w:rPr>
-          <w:sz w:val="28"/>
-          <w:szCs w:val="28"/>
-        </w:rPr>
-      </w:pPr>
-      <w:r>
-        <w:rPr>
-          <w:sz w:val="28"/>
-          <w:szCs w:val="28"/>
-        </w:rPr>
-        <w:t>@import "</w:t>
-      </w:r>
-      <w:proofErr w:type="spellStart"/>
-      <w:r>
-        <w:rPr>
-          <w:sz w:val="28"/>
-          <w:szCs w:val="28"/>
-        </w:rPr>
-        <w:t>tailwindcss</w:t>
-      </w:r>
-      <w:proofErr w:type="spellEnd"/>
-      <w:r>
-        <w:rPr>
-          <w:sz w:val="28"/>
-          <w:szCs w:val="28"/>
-        </w:rPr>
-        <w:t>";</w:t>
-      </w:r>
-    </w:p>
-    <w:p>
-      <w:pPr>
-        <w:rPr>
-          <w:sz w:val="28"/>
-          <w:szCs w:val="28"/>
-        </w:rPr>
-      </w:pPr>
-    </w:p>
-    <w:p>
-      <w:pPr>
-        <w:rPr>
-          <w:sz w:val="28"/>
-          <w:szCs w:val="28"/>
-        </w:rPr>
-      </w:pPr>
-      <w:r>
-        <w:rPr>
-          <w:sz w:val="28"/>
-          <w:szCs w:val="28"/>
-        </w:rPr>
-        <w:t>https://dribbble.com/shots/17602739-Personal-Portfolio-Resume-Landing-Page</w:t>
-      </w:r>
+        <w:t xml:space="preserve"> css</w:t>
+      </w:r>
+    </w:p>
+    <w:p>
+      <w:pPr>
+        <w:rPr>
+          <w:sz w:val="28"/>
+          <w:szCs w:val="28"/>
+        </w:rPr>
+      </w:pPr>
+      <w:r>
+        <w:rPr>
+          <w:sz w:val="28"/>
+          <w:szCs w:val="28"/>
+        </w:rPr>
+        <w:t>@import "tailwindcss";</w:t>
+      </w:r>
+    </w:p>
+    <w:p>
+      <w:pPr>
+        <w:rPr>
+          <w:sz w:val="28"/>
+          <w:szCs w:val="28"/>
+        </w:rPr>
+      </w:pPr>
+    </w:p>
+    <w:p>
+      <w:pPr>
+        <w:rPr>
+          <w:rStyle w:val="Hyperlink"/>
+          <w:sz w:val="28"/>
+          <w:szCs w:val="28"/>
+        </w:rPr>
+      </w:pPr>
+      <w:hyperlink r:id="rId4" w:history="1">
+        <w:r>
+          <w:rPr>
+            <w:rStyle w:val="Hyperlink"/>
+            <w:sz w:val="28"/>
+            <w:szCs w:val="28"/>
+          </w:rPr>
+          <w:t>https://dribbble.com/shots/17602739-Personal-Portfolio-Resume-Landing-Page</w:t>
+        </w:r>
+      </w:hyperlink>
+    </w:p>
+    <w:p>
+      <w:pPr>
+        <w:rPr>
+          <w:rStyle w:val="Hyperlink"/>
+          <w:sz w:val="28"/>
+          <w:szCs w:val="28"/>
+        </w:rPr>
+      </w:pPr>
+    </w:p>
+    <w:p>
+      <w:pPr>
+        <w:pStyle w:val="Heading1"/>
+      </w:pPr>
+      <w:r>
+        <w:t>Deployment</w:t>
+      </w:r>
+    </w:p>
+    <w:p>
+      <w:r>
+        <w:t xml:space="preserve">Deploy to GitHub pages </w:t>
+      </w:r>
+    </w:p>
+    <w:p>
+      <w:r>
+        <w:t>https://www.youtube.com/watch?v=tQ94k7Qop1s</w:t>
+      </w:r>
+    </w:p>
+    <w:p/>
+    <w:p>
+      <w:r>
+        <w:t>Pre-requisition:</w:t>
+      </w:r>
+    </w:p>
+    <w:p>
+      <w:r>
+        <w:lastRenderedPageBreak/>
+        <w:t>1. Create github repo and add your code in main branch and push the same</w:t>
+      </w:r>
+    </w:p>
+    <w:p>
+      <w:r>
+        <w:t>2. Go to github your repository &gt; settings &gt; Github pages (your repo should be public)</w:t>
+      </w:r>
+    </w:p>
+    <w:p>
+      <w:r>
+        <w:t>3. Under "Build and Deploy" change the source to "GitHub Actions" and select "Static pages"</w:t>
+      </w:r>
+    </w:p>
+    <w:p>
+      <w:r>
+        <w:t>4. Under static.yml file, rename to path: 'dist'</w:t>
+      </w:r>
+    </w:p>
+    <w:p>
+      <w:r>
+        <w:t>5. Sync your local branch with the main branch (this will create github/workflows/static.yml)</w:t>
+      </w:r>
+    </w:p>
+    <w:p/>
+    <w:p>
+      <w:r>
+        <w:t xml:space="preserve">1. </w:t>
+      </w:r>
+      <w:proofErr w:type="gramStart"/>
+      <w:r>
+        <w:t>install</w:t>
+      </w:r>
+      <w:proofErr w:type="gramEnd"/>
+      <w:r>
+        <w:t xml:space="preserve"> github pages (npm install gh-pages)</w:t>
+      </w:r>
+    </w:p>
+    <w:p>
+      <w:r>
+        <w:t>2. Go to package.json add home page at the top with the format "homepage</w:t>
+      </w:r>
+      <w:proofErr w:type="gramStart"/>
+      <w:r>
+        <w:t>" :</w:t>
+      </w:r>
+      <w:proofErr w:type="gramEnd"/>
+      <w:r>
+        <w:t xml:space="preserve"> "https://&lt;your-usename&gt;.github.io/&lt;repository-name&gt;/"  ==&gt; after adding custom domain value become "homepage":"&lt;domainname&gt;"</w:t>
+      </w:r>
+    </w:p>
+    <w:p>
+      <w:r>
+        <w:t>3. Go to package.json under scripts section add "predeploy": "npm run build"</w:t>
+      </w:r>
+    </w:p>
+    <w:p>
+      <w:r>
+        <w:t>4. Go to vite.config.js and add base: "/reponame/</w:t>
+      </w:r>
+      <w:proofErr w:type="gramStart"/>
+      <w:r>
+        <w:t>"  =</w:t>
+      </w:r>
+      <w:proofErr w:type="gramEnd"/>
+      <w:r>
+        <w:t>=&gt; after adding custom domain  value become base:"/"</w:t>
+      </w:r>
+    </w:p>
+    <w:p>
+      <w:r>
+        <w:t xml:space="preserve">5. </w:t>
+      </w:r>
+      <w:proofErr w:type="gramStart"/>
+      <w:r>
+        <w:t>in</w:t>
+      </w:r>
+      <w:proofErr w:type="gramEnd"/>
+      <w:r>
+        <w:t xml:space="preserve"> the terminal run "npm run deploy"</w:t>
+      </w:r>
+    </w:p>
+    <w:p>
+      <w:r>
+        <w:t>6. Now push the changes from "main" branch (refer static.yml) it will automatically deployed</w:t>
+      </w:r>
+    </w:p>
+    <w:p/>
+    <w:p>
       <w:bookmarkStart w:id="0" w:name="_GoBack"/>
       <w:bookmarkEnd w:id="0"/>
+    </w:p>
+    <w:p>
+      <w:pPr>
+        <w:rPr>
+          <w:sz w:val="28"/>
+          <w:szCs w:val="28"/>
+        </w:rPr>
+      </w:pPr>
+    </w:p>
+    <w:p>
+      <w:pPr>
+        <w:pStyle w:val="Heading1"/>
+      </w:pPr>
+      <w:r>
+        <w:t>GitHub</w:t>
+      </w:r>
+    </w:p>
+    <w:p>
+      <w:pPr>
+        <w:pStyle w:val="Heading2"/>
+      </w:pPr>
+      <w:r>
+        <w:t>GitHub Rule set</w:t>
+      </w:r>
+    </w:p>
+    <w:p>
+      <w:r>
+        <w:t>Go to gopikrishee/portfolio &gt; Settings &gt; Rule set and added Branch Restriction for main branch</w:t>
+      </w:r>
+      <w:r>
+        <w:t>.</w:t>
+      </w:r>
+    </w:p>
+    <w:p>
+      <w:r>
+        <w:t>No direct commit allowed on main branch all request should go through PR</w:t>
+      </w:r>
     </w:p>
     <w:p>
       <w:pPr>
@@ -1050,10 +1002,52 @@
     <w:name w:val="Normal"/>
     <w:qFormat/>
   </w:style>
+  <w:style w:type="paragraph" w:styleId="Heading1">
+    <w:name w:val="heading 1"/>
+    <w:basedOn w:val="Normal"/>
+    <w:next w:val="Normal"/>
+    <w:link w:val="Heading1Char"/>
+    <w:uiPriority w:val="9"/>
+    <w:qFormat/>
+    <w:rsid w:val="0093321F"/>
+    <w:pPr>
+      <w:keepNext/>
+      <w:keepLines/>
+      <w:spacing w:before="240" w:after="0"/>
+      <w:outlineLvl w:val="0"/>
+    </w:pPr>
+    <w:rPr>
+      <w:rFonts w:asciiTheme="majorHAnsi" w:eastAsiaTheme="majorEastAsia" w:hAnsiTheme="majorHAnsi" w:cstheme="majorBidi"/>
+      <w:color w:val="2E74B5" w:themeColor="accent1" w:themeShade="BF"/>
+      <w:sz w:val="32"/>
+      <w:szCs w:val="32"/>
+    </w:rPr>
+  </w:style>
+  <w:style w:type="paragraph" w:styleId="Heading2">
+    <w:name w:val="heading 2"/>
+    <w:basedOn w:val="Normal"/>
+    <w:next w:val="Normal"/>
+    <w:link w:val="Heading2Char"/>
+    <w:uiPriority w:val="9"/>
+    <w:unhideWhenUsed/>
+    <w:qFormat/>
+    <w:rsid w:val="00833061"/>
+    <w:pPr>
+      <w:keepNext/>
+      <w:keepLines/>
+      <w:spacing w:before="40" w:after="0"/>
+      <w:outlineLvl w:val="1"/>
+    </w:pPr>
+    <w:rPr>
+      <w:rFonts w:asciiTheme="majorHAnsi" w:eastAsiaTheme="majorEastAsia" w:hAnsiTheme="majorHAnsi" w:cstheme="majorBidi"/>
+      <w:color w:val="2E74B5" w:themeColor="accent1" w:themeShade="BF"/>
+      <w:sz w:val="26"/>
+      <w:szCs w:val="26"/>
+    </w:rPr>
+  </w:style>
   <w:style w:type="character" w:default="1" w:styleId="DefaultParagraphFont">
     <w:name w:val="Default Paragraph Font"/>
     <w:uiPriority w:val="1"/>
-    <w:semiHidden/>
     <w:unhideWhenUsed/>
   </w:style>
   <w:style w:type="table" w:default="1" w:styleId="TableNormal">
@@ -1076,6 +1070,43 @@
     <w:uiPriority w:val="99"/>
     <w:semiHidden/>
     <w:unhideWhenUsed/>
+  </w:style>
+  <w:style w:type="character" w:styleId="Hyperlink">
+    <w:name w:val="Hyperlink"/>
+    <w:basedOn w:val="DefaultParagraphFont"/>
+    <w:uiPriority w:val="99"/>
+    <w:unhideWhenUsed/>
+    <w:rsid w:val="006B57C4"/>
+    <w:rPr>
+      <w:color w:val="0563C1" w:themeColor="hyperlink"/>
+      <w:u w:val="single"/>
+    </w:rPr>
+  </w:style>
+  <w:style w:type="character" w:customStyle="1" w:styleId="Heading1Char">
+    <w:name w:val="Heading 1 Char"/>
+    <w:basedOn w:val="DefaultParagraphFont"/>
+    <w:link w:val="Heading1"/>
+    <w:uiPriority w:val="9"/>
+    <w:rsid w:val="0093321F"/>
+    <w:rPr>
+      <w:rFonts w:asciiTheme="majorHAnsi" w:eastAsiaTheme="majorEastAsia" w:hAnsiTheme="majorHAnsi" w:cstheme="majorBidi"/>
+      <w:color w:val="2E74B5" w:themeColor="accent1" w:themeShade="BF"/>
+      <w:sz w:val="32"/>
+      <w:szCs w:val="32"/>
+    </w:rPr>
+  </w:style>
+  <w:style w:type="character" w:customStyle="1" w:styleId="Heading2Char">
+    <w:name w:val="Heading 2 Char"/>
+    <w:basedOn w:val="DefaultParagraphFont"/>
+    <w:link w:val="Heading2"/>
+    <w:uiPriority w:val="9"/>
+    <w:rsid w:val="00833061"/>
+    <w:rPr>
+      <w:rFonts w:asciiTheme="majorHAnsi" w:eastAsiaTheme="majorEastAsia" w:hAnsiTheme="majorHAnsi" w:cstheme="majorBidi"/>
+      <w:color w:val="2E74B5" w:themeColor="accent1" w:themeShade="BF"/>
+      <w:sz w:val="26"/>
+      <w:szCs w:val="26"/>
+    </w:rPr>
   </w:style>
 </w:styles>
 </file>

</xml_diff>

<commit_message>
#2 - Contact section updated
</commit_message>
<xml_diff>
--- a/myprofiledoc.docx
+++ b/myprofiledoc.docx
@@ -24,6 +24,7 @@
           <w:szCs w:val="28"/>
         </w:rPr>
       </w:pPr>
+      <w:proofErr w:type="spellStart"/>
       <w:proofErr w:type="gramStart"/>
       <w:r>
         <w:rPr>
@@ -32,22 +33,33 @@
         </w:rPr>
         <w:t>npm</w:t>
       </w:r>
+      <w:proofErr w:type="spellEnd"/>
       <w:proofErr w:type="gramEnd"/>
       <w:r>
         <w:rPr>
           <w:sz w:val="28"/>
           <w:szCs w:val="28"/>
         </w:rPr>
-        <w:t xml:space="preserve"> create vite@latest</w:t>
-      </w:r>
-    </w:p>
-    <w:p>
-      <w:pPr>
-        <w:rPr>
-          <w:sz w:val="28"/>
-          <w:szCs w:val="28"/>
-        </w:rPr>
-      </w:pPr>
+        <w:t xml:space="preserve"> create </w:t>
+      </w:r>
+      <w:proofErr w:type="spellStart"/>
+      <w:r>
+        <w:rPr>
+          <w:sz w:val="28"/>
+          <w:szCs w:val="28"/>
+        </w:rPr>
+        <w:t>vite@latest</w:t>
+      </w:r>
+      <w:proofErr w:type="spellEnd"/>
+    </w:p>
+    <w:p>
+      <w:pPr>
+        <w:rPr>
+          <w:sz w:val="28"/>
+          <w:szCs w:val="28"/>
+        </w:rPr>
+      </w:pPr>
+      <w:proofErr w:type="spellStart"/>
       <w:proofErr w:type="gramStart"/>
       <w:r>
         <w:rPr>
@@ -56,6 +68,7 @@
         </w:rPr>
         <w:t>npm</w:t>
       </w:r>
+      <w:proofErr w:type="spellEnd"/>
       <w:proofErr w:type="gramEnd"/>
       <w:r>
         <w:rPr>
@@ -85,16 +98,26 @@
           <w:sz w:val="28"/>
           <w:szCs w:val="28"/>
         </w:rPr>
-        <w:t>Install tailwind css</w:t>
-      </w:r>
-    </w:p>
-    <w:p>
-      <w:pPr>
-        <w:rPr>
-          <w:sz w:val="28"/>
-          <w:szCs w:val="28"/>
-        </w:rPr>
-      </w:pPr>
+        <w:t xml:space="preserve">Install tailwind </w:t>
+      </w:r>
+      <w:proofErr w:type="spellStart"/>
+      <w:r>
+        <w:rPr>
+          <w:sz w:val="28"/>
+          <w:szCs w:val="28"/>
+        </w:rPr>
+        <w:t>css</w:t>
+      </w:r>
+      <w:proofErr w:type="spellEnd"/>
+    </w:p>
+    <w:p>
+      <w:pPr>
+        <w:rPr>
+          <w:sz w:val="28"/>
+          <w:szCs w:val="28"/>
+        </w:rPr>
+      </w:pPr>
+      <w:proofErr w:type="spellStart"/>
       <w:proofErr w:type="gramStart"/>
       <w:r>
         <w:rPr>
@@ -103,13 +126,30 @@
         </w:rPr>
         <w:t>npm</w:t>
       </w:r>
+      <w:proofErr w:type="spellEnd"/>
       <w:proofErr w:type="gramEnd"/>
       <w:r>
         <w:rPr>
           <w:sz w:val="28"/>
           <w:szCs w:val="28"/>
         </w:rPr>
-        <w:t xml:space="preserve"> create vite@latest my-project</w:t>
+        <w:t xml:space="preserve"> create </w:t>
+      </w:r>
+      <w:proofErr w:type="spellStart"/>
+      <w:r>
+        <w:rPr>
+          <w:sz w:val="28"/>
+          <w:szCs w:val="28"/>
+        </w:rPr>
+        <w:t>vite@latest</w:t>
+      </w:r>
+      <w:proofErr w:type="spellEnd"/>
+      <w:r>
+        <w:rPr>
+          <w:sz w:val="28"/>
+          <w:szCs w:val="28"/>
+        </w:rPr>
+        <w:t xml:space="preserve"> my-project</w:t>
       </w:r>
     </w:p>
     <w:p>
@@ -143,6 +183,7 @@
           <w:szCs w:val="28"/>
         </w:rPr>
       </w:pPr>
+      <w:proofErr w:type="spellStart"/>
       <w:proofErr w:type="gramStart"/>
       <w:r>
         <w:rPr>
@@ -151,14 +192,56 @@
         </w:rPr>
         <w:t>npm</w:t>
       </w:r>
+      <w:proofErr w:type="spellEnd"/>
       <w:proofErr w:type="gramEnd"/>
       <w:r>
         <w:rPr>
           <w:sz w:val="28"/>
           <w:szCs w:val="28"/>
         </w:rPr>
-        <w:t xml:space="preserve"> install tailwindcss @tailwindcss/vite</w:t>
-      </w:r>
+        <w:t xml:space="preserve"> install </w:t>
+      </w:r>
+      <w:proofErr w:type="spellStart"/>
+      <w:r>
+        <w:rPr>
+          <w:sz w:val="28"/>
+          <w:szCs w:val="28"/>
+        </w:rPr>
+        <w:t>tailwindcss</w:t>
+      </w:r>
+      <w:proofErr w:type="spellEnd"/>
+      <w:r>
+        <w:rPr>
+          <w:sz w:val="28"/>
+          <w:szCs w:val="28"/>
+        </w:rPr>
+        <w:t xml:space="preserve"> @</w:t>
+      </w:r>
+      <w:proofErr w:type="spellStart"/>
+      <w:r>
+        <w:rPr>
+          <w:sz w:val="28"/>
+          <w:szCs w:val="28"/>
+        </w:rPr>
+        <w:t>tailwindcss</w:t>
+      </w:r>
+      <w:proofErr w:type="spellEnd"/>
+      <w:r>
+        <w:rPr>
+          <w:sz w:val="28"/>
+          <w:szCs w:val="28"/>
+        </w:rPr>
+        <w:t>/</w:t>
+      </w:r>
+      <w:proofErr w:type="spellStart"/>
+      <w:r>
+        <w:rPr>
+          <w:sz w:val="28"/>
+          <w:szCs w:val="28"/>
+        </w:rPr>
+        <w:t>vite</w:t>
+      </w:r>
+      <w:proofErr w:type="spellEnd"/>
     </w:p>
     <w:p>
       <w:pPr>
@@ -176,6 +259,7 @@
           <w:u w:val="single"/>
         </w:rPr>
       </w:pPr>
+      <w:proofErr w:type="spellStart"/>
       <w:r>
         <w:rPr>
           <w:sz w:val="28"/>
@@ -184,6 +268,7 @@
         </w:rPr>
         <w:t>vite.config.ts</w:t>
       </w:r>
+      <w:proofErr w:type="spellEnd"/>
     </w:p>
     <w:p>
       <w:pPr>
@@ -206,7 +291,39 @@
           <w:sz w:val="28"/>
           <w:szCs w:val="28"/>
         </w:rPr>
-        <w:t xml:space="preserve"> { defineConfig } from 'vite'</w:t>
+        <w:t xml:space="preserve"> { </w:t>
+      </w:r>
+      <w:proofErr w:type="spellStart"/>
+      <w:r>
+        <w:rPr>
+          <w:sz w:val="28"/>
+          <w:szCs w:val="28"/>
+        </w:rPr>
+        <w:t>defineConfig</w:t>
+      </w:r>
+      <w:proofErr w:type="spellEnd"/>
+      <w:r>
+        <w:rPr>
+          <w:sz w:val="28"/>
+          <w:szCs w:val="28"/>
+        </w:rPr>
+        <w:t xml:space="preserve"> } from '</w:t>
+      </w:r>
+      <w:proofErr w:type="spellStart"/>
+      <w:r>
+        <w:rPr>
+          <w:sz w:val="28"/>
+          <w:szCs w:val="28"/>
+        </w:rPr>
+        <w:t>vite</w:t>
+      </w:r>
+      <w:proofErr w:type="spellEnd"/>
+      <w:r>
+        <w:rPr>
+          <w:sz w:val="28"/>
+          <w:szCs w:val="28"/>
+        </w:rPr>
+        <w:t>'</w:t>
       </w:r>
     </w:p>
     <w:p>
@@ -230,7 +347,55 @@
           <w:sz w:val="28"/>
           <w:szCs w:val="28"/>
         </w:rPr>
-        <w:t xml:space="preserve"> tailwindcss from '@tailwindcss/vite'</w:t>
+        <w:t xml:space="preserve"> </w:t>
+      </w:r>
+      <w:proofErr w:type="spellStart"/>
+      <w:r>
+        <w:rPr>
+          <w:sz w:val="28"/>
+          <w:szCs w:val="28"/>
+        </w:rPr>
+        <w:t>tailwindcss</w:t>
+      </w:r>
+      <w:proofErr w:type="spellEnd"/>
+      <w:r>
+        <w:rPr>
+          <w:sz w:val="28"/>
+          <w:szCs w:val="28"/>
+        </w:rPr>
+        <w:t xml:space="preserve"> from '@</w:t>
+      </w:r>
+      <w:proofErr w:type="spellStart"/>
+      <w:r>
+        <w:rPr>
+          <w:sz w:val="28"/>
+          <w:szCs w:val="28"/>
+        </w:rPr>
+        <w:t>tailwindcss</w:t>
+      </w:r>
+      <w:proofErr w:type="spellEnd"/>
+      <w:r>
+        <w:rPr>
+          <w:sz w:val="28"/>
+          <w:szCs w:val="28"/>
+        </w:rPr>
+        <w:t>/</w:t>
+      </w:r>
+      <w:proofErr w:type="spellStart"/>
+      <w:r>
+        <w:rPr>
+          <w:sz w:val="28"/>
+          <w:szCs w:val="28"/>
+        </w:rPr>
+        <w:t>vite</w:t>
+      </w:r>
+      <w:proofErr w:type="spellEnd"/>
+      <w:r>
+        <w:rPr>
+          <w:sz w:val="28"/>
+          <w:szCs w:val="28"/>
+        </w:rPr>
+        <w:t>'</w:t>
       </w:r>
     </w:p>
     <w:p>
@@ -262,7 +427,23 @@
           <w:sz w:val="28"/>
           <w:szCs w:val="28"/>
         </w:rPr>
-        <w:t xml:space="preserve"> default defineConfig({</w:t>
+        <w:t xml:space="preserve"> default </w:t>
+      </w:r>
+      <w:proofErr w:type="spellStart"/>
+      <w:r>
+        <w:rPr>
+          <w:sz w:val="28"/>
+          <w:szCs w:val="28"/>
+        </w:rPr>
+        <w:t>defineConfig</w:t>
+      </w:r>
+      <w:proofErr w:type="spellEnd"/>
+      <w:r>
+        <w:rPr>
+          <w:sz w:val="28"/>
+          <w:szCs w:val="28"/>
+        </w:rPr>
+        <w:t>({</w:t>
       </w:r>
     </w:p>
     <w:p>
@@ -310,13 +491,22 @@
         </w:rPr>
         <w:t xml:space="preserve">    </w:t>
       </w:r>
+      <w:proofErr w:type="spellStart"/>
       <w:proofErr w:type="gramStart"/>
       <w:r>
         <w:rPr>
           <w:sz w:val="28"/>
           <w:szCs w:val="28"/>
         </w:rPr>
-        <w:t>tailwindcss(</w:t>
+        <w:t>tailwindcss</w:t>
+      </w:r>
+      <w:proofErr w:type="spellEnd"/>
+      <w:r>
+        <w:rPr>
+          <w:sz w:val="28"/>
+          <w:szCs w:val="28"/>
+        </w:rPr>
+        <w:t>(</w:t>
       </w:r>
       <w:proofErr w:type="gramEnd"/>
       <w:r>
@@ -381,22 +571,48 @@
           <w:szCs w:val="28"/>
           <w:u w:val="single"/>
         </w:rPr>
-        <w:t xml:space="preserve"> css</w:t>
-      </w:r>
-    </w:p>
-    <w:p>
-      <w:pPr>
-        <w:rPr>
-          <w:sz w:val="28"/>
-          <w:szCs w:val="28"/>
-        </w:rPr>
-      </w:pPr>
-      <w:r>
-        <w:rPr>
-          <w:sz w:val="28"/>
-          <w:szCs w:val="28"/>
-        </w:rPr>
-        <w:t>@import "tailwindcss";</w:t>
+        <w:t xml:space="preserve"> </w:t>
+      </w:r>
+      <w:proofErr w:type="spellStart"/>
+      <w:r>
+        <w:rPr>
+          <w:sz w:val="28"/>
+          <w:szCs w:val="28"/>
+          <w:u w:val="single"/>
+        </w:rPr>
+        <w:t>css</w:t>
+      </w:r>
+      <w:proofErr w:type="spellEnd"/>
+    </w:p>
+    <w:p>
+      <w:pPr>
+        <w:rPr>
+          <w:sz w:val="28"/>
+          <w:szCs w:val="28"/>
+        </w:rPr>
+      </w:pPr>
+      <w:r>
+        <w:rPr>
+          <w:sz w:val="28"/>
+          <w:szCs w:val="28"/>
+        </w:rPr>
+        <w:t>@import "</w:t>
+      </w:r>
+      <w:proofErr w:type="spellStart"/>
+      <w:r>
+        <w:rPr>
+          <w:sz w:val="28"/>
+          <w:szCs w:val="28"/>
+        </w:rPr>
+        <w:t>tailwindcss</w:t>
+      </w:r>
+      <w:proofErr w:type="spellEnd"/>
+      <w:r>
+        <w:rPr>
+          <w:sz w:val="28"/>
+          <w:szCs w:val="28"/>
+        </w:rPr>
+        <w:t>";</w:t>
       </w:r>
     </w:p>
     <w:p>
@@ -462,12 +678,36 @@
     <w:p>
       <w:r>
         <w:lastRenderedPageBreak/>
-        <w:t>1. Create github repo and add your code in main branch and push the same</w:t>
-      </w:r>
-    </w:p>
-    <w:p>
-      <w:r>
-        <w:t>2. Go to github your repository &gt; settings &gt; Github pages (your repo should be public)</w:t>
+        <w:t xml:space="preserve">1. Create </w:t>
+      </w:r>
+      <w:proofErr w:type="spellStart"/>
+      <w:r>
+        <w:t>github</w:t>
+      </w:r>
+      <w:proofErr w:type="spellEnd"/>
+      <w:r>
+        <w:t xml:space="preserve"> repo and add your code in main branch and push the same</w:t>
+      </w:r>
+    </w:p>
+    <w:p>
+      <w:r>
+        <w:t xml:space="preserve">2. Go to </w:t>
+      </w:r>
+      <w:proofErr w:type="spellStart"/>
+      <w:r>
+        <w:t>github</w:t>
+      </w:r>
+      <w:proofErr w:type="spellEnd"/>
+      <w:r>
+        <w:t xml:space="preserve"> your repository &gt; settings &gt; </w:t>
+      </w:r>
+      <w:proofErr w:type="spellStart"/>
+      <w:r>
+        <w:t>Github</w:t>
+      </w:r>
+      <w:proofErr w:type="spellEnd"/>
+      <w:r>
+        <w:t xml:space="preserve"> pages (your repo should be public)</w:t>
       </w:r>
     </w:p>
     <w:p>
@@ -477,12 +717,44 @@
     </w:p>
     <w:p>
       <w:r>
-        <w:t>4. Under static.yml file, rename to path: 'dist'</w:t>
-      </w:r>
-    </w:p>
-    <w:p>
-      <w:r>
-        <w:t>5. Sync your local branch with the main branch (this will create github/workflows/static.yml)</w:t>
+        <w:t xml:space="preserve">4. Under </w:t>
+      </w:r>
+      <w:proofErr w:type="spellStart"/>
+      <w:r>
+        <w:t>static.yml</w:t>
+      </w:r>
+      <w:proofErr w:type="spellEnd"/>
+      <w:r>
+        <w:t xml:space="preserve"> file, rename to path: '</w:t>
+      </w:r>
+      <w:proofErr w:type="spellStart"/>
+      <w:r>
+        <w:t>dist</w:t>
+      </w:r>
+      <w:proofErr w:type="spellEnd"/>
+      <w:r>
+        <w:t>'</w:t>
+      </w:r>
+    </w:p>
+    <w:p>
+      <w:r>
+        <w:t xml:space="preserve">5. Sync your local branch with the main branch (this will create </w:t>
+      </w:r>
+      <w:proofErr w:type="spellStart"/>
+      <w:r>
+        <w:t>github</w:t>
+      </w:r>
+      <w:proofErr w:type="spellEnd"/>
+      <w:r>
+        <w:t>/workflows/</w:t>
+      </w:r>
+      <w:proofErr w:type="spellStart"/>
+      <w:r>
+        <w:t>static.yml</w:t>
+      </w:r>
+      <w:proofErr w:type="spellEnd"/>
+      <w:r>
+        <w:t>)</w:t>
       </w:r>
     </w:p>
     <w:p/>
@@ -496,12 +768,44 @@
       </w:r>
       <w:proofErr w:type="gramEnd"/>
       <w:r>
-        <w:t xml:space="preserve"> github pages (npm install gh-pages)</w:t>
-      </w:r>
-    </w:p>
-    <w:p>
-      <w:r>
-        <w:t>2. Go to package.json add home page at the top with the format "homepage</w:t>
+        <w:t xml:space="preserve"> </w:t>
+      </w:r>
+      <w:proofErr w:type="spellStart"/>
+      <w:r>
+        <w:t>github</w:t>
+      </w:r>
+      <w:proofErr w:type="spellEnd"/>
+      <w:r>
+        <w:t xml:space="preserve"> pages (</w:t>
+      </w:r>
+      <w:proofErr w:type="spellStart"/>
+      <w:r>
+        <w:t>npm</w:t>
+      </w:r>
+      <w:proofErr w:type="spellEnd"/>
+      <w:r>
+        <w:t xml:space="preserve"> install </w:t>
+      </w:r>
+      <w:proofErr w:type="spellStart"/>
+      <w:r>
+        <w:t>gh</w:t>
+      </w:r>
+      <w:proofErr w:type="spellEnd"/>
+      <w:r>
+        <w:t>-pages)</w:t>
+      </w:r>
+    </w:p>
+    <w:p>
+      <w:r>
+        <w:t xml:space="preserve">2. Go to </w:t>
+      </w:r>
+      <w:proofErr w:type="spellStart"/>
+      <w:r>
+        <w:t>package.json</w:t>
+      </w:r>
+      <w:proofErr w:type="spellEnd"/>
+      <w:r>
+        <w:t xml:space="preserve"> add home page at the top with the format "homepage</w:t>
       </w:r>
       <w:proofErr w:type="gramStart"/>
       <w:r>
@@ -509,17 +813,65 @@
       </w:r>
       <w:proofErr w:type="gramEnd"/>
       <w:r>
-        <w:t xml:space="preserve"> "https://&lt;your-usename&gt;.github.io/&lt;repository-name&gt;/"  ==&gt; after adding custom domain value become "homepage":"&lt;domainname&gt;"</w:t>
-      </w:r>
-    </w:p>
-    <w:p>
-      <w:r>
-        <w:t>3. Go to package.json under scripts section add "predeploy": "npm run build"</w:t>
-      </w:r>
-    </w:p>
-    <w:p>
-      <w:r>
-        <w:t>4. Go to vite.config.js and add base: "/reponame/</w:t>
+        <w:t xml:space="preserve"> "https://&lt;your-</w:t>
+      </w:r>
+      <w:proofErr w:type="spellStart"/>
+      <w:r>
+        <w:t>usename</w:t>
+      </w:r>
+      <w:proofErr w:type="spellEnd"/>
+      <w:r>
+        <w:t>&gt;.github.io/&lt;repository-name&gt;/"  ==&gt; after adding custom domain value become "homepage":"&lt;</w:t>
+      </w:r>
+      <w:proofErr w:type="spellStart"/>
+      <w:r>
+        <w:t>domainname</w:t>
+      </w:r>
+      <w:proofErr w:type="spellEnd"/>
+      <w:r>
+        <w:t>&gt;"</w:t>
+      </w:r>
+    </w:p>
+    <w:p>
+      <w:r>
+        <w:t xml:space="preserve">3. Go to </w:t>
+      </w:r>
+      <w:proofErr w:type="spellStart"/>
+      <w:r>
+        <w:t>package.json</w:t>
+      </w:r>
+      <w:proofErr w:type="spellEnd"/>
+      <w:r>
+        <w:t xml:space="preserve"> under scripts section add "</w:t>
+      </w:r>
+      <w:proofErr w:type="spellStart"/>
+      <w:r>
+        <w:t>predeploy</w:t>
+      </w:r>
+      <w:proofErr w:type="spellEnd"/>
+      <w:r>
+        <w:t>": "</w:t>
+      </w:r>
+      <w:proofErr w:type="spellStart"/>
+      <w:r>
+        <w:t>npm</w:t>
+      </w:r>
+      <w:proofErr w:type="spellEnd"/>
+      <w:r>
+        <w:t xml:space="preserve"> run build"</w:t>
+      </w:r>
+    </w:p>
+    <w:p>
+      <w:r>
+        <w:t>4. Go to vite.config.js and add base: "/</w:t>
+      </w:r>
+      <w:proofErr w:type="spellStart"/>
+      <w:r>
+        <w:t>reponame</w:t>
+      </w:r>
+      <w:proofErr w:type="spellEnd"/>
+      <w:r>
+        <w:t>/</w:t>
       </w:r>
       <w:proofErr w:type="gramStart"/>
       <w:r>
@@ -540,63 +892,95 @@
       </w:r>
       <w:proofErr w:type="gramEnd"/>
       <w:r>
-        <w:t xml:space="preserve"> the terminal run "npm run deploy"</w:t>
-      </w:r>
-    </w:p>
-    <w:p>
-      <w:r>
-        <w:t>6. Now push the changes from "main" branch (refer static.yml) it will automatically deployed</w:t>
+        <w:t xml:space="preserve"> the terminal run "</w:t>
+      </w:r>
+      <w:proofErr w:type="spellStart"/>
+      <w:r>
+        <w:t>npm</w:t>
+      </w:r>
+      <w:proofErr w:type="spellEnd"/>
+      <w:r>
+        <w:t xml:space="preserve"> run deploy"</w:t>
+      </w:r>
+    </w:p>
+    <w:p>
+      <w:r>
+        <w:t xml:space="preserve">6. Now push the changes from "main" branch (refer </w:t>
+      </w:r>
+      <w:proofErr w:type="spellStart"/>
+      <w:r>
+        <w:t>static.yml</w:t>
+      </w:r>
+      <w:proofErr w:type="spellEnd"/>
+      <w:r>
+        <w:t>) it will automatically deployed</w:t>
       </w:r>
     </w:p>
     <w:p/>
-    <w:p>
+    <w:p/>
+    <w:p>
+      <w:pPr>
+        <w:rPr>
+          <w:sz w:val="28"/>
+          <w:szCs w:val="28"/>
+        </w:rPr>
+      </w:pPr>
+    </w:p>
+    <w:p>
+      <w:pPr>
+        <w:pStyle w:val="Heading1"/>
+      </w:pPr>
+      <w:r>
+        <w:t>GitHub</w:t>
+      </w:r>
+    </w:p>
+    <w:p>
+      <w:pPr>
+        <w:pStyle w:val="Heading2"/>
+      </w:pPr>
+      <w:r>
+        <w:t>GitHub Rule set</w:t>
+      </w:r>
+    </w:p>
+    <w:p>
+      <w:r>
+        <w:t xml:space="preserve">Go to </w:t>
+      </w:r>
+      <w:proofErr w:type="spellStart"/>
+      <w:r>
+        <w:t>gopikrishee</w:t>
+      </w:r>
+      <w:proofErr w:type="spellEnd"/>
+      <w:r>
+        <w:t>/portfolio &gt; Settings &gt; Rule set and added Branch Restriction for main branch</w:t>
+      </w:r>
+      <w:r>
+        <w:t>.</w:t>
+      </w:r>
+    </w:p>
+    <w:p>
+      <w:r>
+        <w:t>No direct commit allowed on main branch all request should go through PR</w:t>
+      </w:r>
+    </w:p>
+    <w:p/>
+    <w:p>
+      <w:pPr>
+        <w:pStyle w:val="Heading2"/>
+      </w:pPr>
+      <w:r>
+        <w:t>Auto-assign a branch to issue</w:t>
+      </w:r>
+    </w:p>
+    <w:p>
+      <w:r>
+        <w:t>&lt;issue-number&gt;-&lt;short-description&gt;</w:t>
+      </w:r>
+      <w:r>
+        <w:t xml:space="preserve"> follow the naming convension</w:t>
+      </w:r>
       <w:bookmarkStart w:id="0" w:name="_GoBack"/>
       <w:bookmarkEnd w:id="0"/>
-    </w:p>
-    <w:p>
-      <w:pPr>
-        <w:rPr>
-          <w:sz w:val="28"/>
-          <w:szCs w:val="28"/>
-        </w:rPr>
-      </w:pPr>
-    </w:p>
-    <w:p>
-      <w:pPr>
-        <w:pStyle w:val="Heading1"/>
-      </w:pPr>
-      <w:r>
-        <w:t>GitHub</w:t>
-      </w:r>
-    </w:p>
-    <w:p>
-      <w:pPr>
-        <w:pStyle w:val="Heading2"/>
-      </w:pPr>
-      <w:r>
-        <w:t>GitHub Rule set</w:t>
-      </w:r>
-    </w:p>
-    <w:p>
-      <w:r>
-        <w:t>Go to gopikrishee/portfolio &gt; Settings &gt; Rule set and added Branch Restriction for main branch</w:t>
-      </w:r>
-      <w:r>
-        <w:t>.</w:t>
-      </w:r>
-    </w:p>
-    <w:p>
-      <w:r>
-        <w:t>No direct commit allowed on main branch all request should go through PR</w:t>
-      </w:r>
-    </w:p>
-    <w:p>
-      <w:pPr>
-        <w:rPr>
-          <w:sz w:val="28"/>
-          <w:szCs w:val="28"/>
-        </w:rPr>
-      </w:pPr>
     </w:p>
     <w:sectPr>
       <w:pgSz w:w="12240" w:h="15840"/>
@@ -1048,6 +1432,7 @@
   <w:style w:type="character" w:default="1" w:styleId="DefaultParagraphFont">
     <w:name w:val="Default Paragraph Font"/>
     <w:uiPriority w:val="1"/>
+    <w:semiHidden/>
     <w:unhideWhenUsed/>
   </w:style>
   <w:style w:type="table" w:default="1" w:styleId="TableNormal">

</xml_diff>

<commit_message>
folder restructure and recent projects added
</commit_message>
<xml_diff>
--- a/myprofiledoc.docx
+++ b/myprofiledoc.docx
@@ -631,7 +631,7 @@
           <w:szCs w:val="28"/>
         </w:rPr>
       </w:pPr>
-      <w:hyperlink r:id="rId4" w:history="1">
+      <w:hyperlink r:id="rId5" w:history="1">
         <w:r>
           <w:rPr>
             <w:rStyle w:val="Hyperlink"/>
@@ -654,6 +654,510 @@
     <w:p>
       <w:pPr>
         <w:pStyle w:val="Heading1"/>
+        <w:rPr>
+          <w:rStyle w:val="Hyperlink"/>
+          <w:sz w:val="28"/>
+          <w:szCs w:val="28"/>
+          <w:u w:val="none"/>
+        </w:rPr>
+      </w:pPr>
+      <w:r>
+        <w:rPr>
+          <w:rStyle w:val="Hyperlink"/>
+          <w:sz w:val="28"/>
+          <w:szCs w:val="28"/>
+          <w:u w:val="none"/>
+        </w:rPr>
+        <w:t>File structure</w:t>
+      </w:r>
+    </w:p>
+    <w:p>
+      <w:pPr>
+        <w:rPr>
+          <w:rStyle w:val="Hyperlink"/>
+          <w:sz w:val="28"/>
+          <w:szCs w:val="28"/>
+        </w:rPr>
+      </w:pPr>
+      <w:r>
+        <w:rPr>
+          <w:rStyle w:val="Hyperlink"/>
+          <w:sz w:val="28"/>
+          <w:szCs w:val="28"/>
+        </w:rPr>
+        <w:object w:dxaOrig="2971" w:dyaOrig="810">
+          <v:shapetype id="_x0000_t75" coordsize="21600,21600" o:spt="75" o:preferrelative="t" path="m@4@5l@4@11@9@11@9@5xe" filled="f" stroked="f">
+            <v:stroke joinstyle="miter"/>
+            <v:formulas>
+              <v:f eqn="if lineDrawn pixelLineWidth 0"/>
+              <v:f eqn="sum @0 1 0"/>
+              <v:f eqn="sum 0 0 @1"/>
+              <v:f eqn="prod @2 1 2"/>
+              <v:f eqn="prod @3 21600 pixelWidth"/>
+              <v:f eqn="prod @3 21600 pixelHeight"/>
+              <v:f eqn="sum @0 0 1"/>
+              <v:f eqn="prod @6 1 2"/>
+              <v:f eqn="prod @7 21600 pixelWidth"/>
+              <v:f eqn="sum @8 21600 0"/>
+              <v:f eqn="prod @7 21600 pixelHeight"/>
+              <v:f eqn="sum @10 21600 0"/>
+            </v:formulas>
+            <v:path o:extrusionok="f" gradientshapeok="t" o:connecttype="rect"/>
+            <o:lock v:ext="edit" aspectratio="t"/>
+          </v:shapetype>
+          <v:shape id="_x0000_i1025" type="#_x0000_t75" style="width:148.5pt;height:40.5pt" o:ole="">
+            <v:imagedata r:id="rId6" o:title=""/>
+          </v:shape>
+          <o:OLEObject Type="Embed" ProgID="Package" ShapeID="_x0000_i1025" DrawAspect="Content" ObjectID="_1836931174" r:id="rId7"/>
+        </w:object>
+      </w:r>
+    </w:p>
+    <w:p>
+      <w:pPr>
+        <w:pStyle w:val="font-claude-response-body"/>
+        <w:rPr>
+          <w:rFonts w:asciiTheme="minorHAnsi" w:hAnsiTheme="minorHAnsi" w:cstheme="minorHAnsi"/>
+        </w:rPr>
+      </w:pPr>
+      <w:r>
+        <w:rPr>
+          <w:rFonts w:asciiTheme="minorHAnsi" w:hAnsiTheme="minorHAnsi" w:cstheme="minorHAnsi"/>
+        </w:rPr>
+        <w:t>Here's the rationale for each layer:</w:t>
+      </w:r>
+    </w:p>
+    <w:p>
+      <w:pPr>
+        <w:pStyle w:val="font-claude-response-body"/>
+        <w:rPr>
+          <w:rFonts w:asciiTheme="minorHAnsi" w:hAnsiTheme="minorHAnsi" w:cstheme="minorHAnsi"/>
+        </w:rPr>
+      </w:pPr>
+      <w:proofErr w:type="spellStart"/>
+      <w:proofErr w:type="gramStart"/>
+      <w:r>
+        <w:rPr>
+          <w:rStyle w:val="HTMLCode"/>
+          <w:rFonts w:asciiTheme="minorHAnsi" w:hAnsiTheme="minorHAnsi" w:cstheme="minorHAnsi"/>
+          <w:b/>
+          <w:bCs/>
+        </w:rPr>
+        <w:lastRenderedPageBreak/>
+        <w:t>api</w:t>
+      </w:r>
+      <w:proofErr w:type="spellEnd"/>
+      <w:proofErr w:type="gramEnd"/>
+      <w:r>
+        <w:rPr>
+          <w:rStyle w:val="HTMLCode"/>
+          <w:rFonts w:asciiTheme="minorHAnsi" w:hAnsiTheme="minorHAnsi" w:cstheme="minorHAnsi"/>
+          <w:b/>
+          <w:bCs/>
+        </w:rPr>
+        <w:t>/</w:t>
+      </w:r>
+      <w:r>
+        <w:rPr>
+          <w:rFonts w:asciiTheme="minorHAnsi" w:hAnsiTheme="minorHAnsi" w:cstheme="minorHAnsi"/>
+        </w:rPr>
+        <w:t xml:space="preserve"> — This is the only place HTTP lives. Each file maps to one backend resource (e.g. </w:t>
+      </w:r>
+      <w:r>
+        <w:rPr>
+          <w:rStyle w:val="HTMLCode"/>
+          <w:rFonts w:asciiTheme="minorHAnsi" w:hAnsiTheme="minorHAnsi" w:cstheme="minorHAnsi"/>
+        </w:rPr>
+        <w:t>userApi.js</w:t>
+      </w:r>
+      <w:r>
+        <w:rPr>
+          <w:rFonts w:asciiTheme="minorHAnsi" w:hAnsiTheme="minorHAnsi" w:cstheme="minorHAnsi"/>
+        </w:rPr>
+        <w:t xml:space="preserve"> handles all user endpoints). This means if your base URL or </w:t>
+      </w:r>
+      <w:proofErr w:type="spellStart"/>
+      <w:r>
+        <w:rPr>
+          <w:rFonts w:asciiTheme="minorHAnsi" w:hAnsiTheme="minorHAnsi" w:cstheme="minorHAnsi"/>
+        </w:rPr>
+        <w:t>auth</w:t>
+      </w:r>
+      <w:proofErr w:type="spellEnd"/>
+      <w:r>
+        <w:rPr>
+          <w:rFonts w:asciiTheme="minorHAnsi" w:hAnsiTheme="minorHAnsi" w:cstheme="minorHAnsi"/>
+        </w:rPr>
+        <w:t xml:space="preserve"> headers ever change, you fix it in one place. Example: </w:t>
+      </w:r>
+      <w:proofErr w:type="spellStart"/>
+      <w:r>
+        <w:rPr>
+          <w:rStyle w:val="HTMLCode"/>
+          <w:rFonts w:asciiTheme="minorHAnsi" w:hAnsiTheme="minorHAnsi" w:cstheme="minorHAnsi"/>
+        </w:rPr>
+        <w:t>axiosInstance</w:t>
+      </w:r>
+      <w:proofErr w:type="spellEnd"/>
+      <w:r>
+        <w:rPr>
+          <w:rFonts w:asciiTheme="minorHAnsi" w:hAnsiTheme="minorHAnsi" w:cstheme="minorHAnsi"/>
+        </w:rPr>
+        <w:t xml:space="preserve"> or a shared </w:t>
+      </w:r>
+      <w:r>
+        <w:rPr>
+          <w:rStyle w:val="HTMLCode"/>
+          <w:rFonts w:asciiTheme="minorHAnsi" w:hAnsiTheme="minorHAnsi" w:cstheme="minorHAnsi"/>
+        </w:rPr>
+        <w:t>fetch</w:t>
+      </w:r>
+      <w:r>
+        <w:rPr>
+          <w:rFonts w:asciiTheme="minorHAnsi" w:hAnsiTheme="minorHAnsi" w:cstheme="minorHAnsi"/>
+        </w:rPr>
+        <w:t xml:space="preserve"> wrapper lives here in an </w:t>
+      </w:r>
+      <w:r>
+        <w:rPr>
+          <w:rStyle w:val="HTMLCode"/>
+          <w:rFonts w:asciiTheme="minorHAnsi" w:hAnsiTheme="minorHAnsi" w:cstheme="minorHAnsi"/>
+        </w:rPr>
+        <w:t>index.js</w:t>
+      </w:r>
+      <w:r>
+        <w:rPr>
+          <w:rFonts w:asciiTheme="minorHAnsi" w:hAnsiTheme="minorHAnsi" w:cstheme="minorHAnsi"/>
+        </w:rPr>
+        <w:t>.</w:t>
+      </w:r>
+    </w:p>
+    <w:p>
+      <w:pPr>
+        <w:pStyle w:val="font-claude-response-body"/>
+        <w:rPr>
+          <w:rFonts w:asciiTheme="minorHAnsi" w:hAnsiTheme="minorHAnsi" w:cstheme="minorHAnsi"/>
+        </w:rPr>
+      </w:pPr>
+      <w:proofErr w:type="gramStart"/>
+      <w:r>
+        <w:rPr>
+          <w:rStyle w:val="HTMLCode"/>
+          <w:rFonts w:asciiTheme="minorHAnsi" w:hAnsiTheme="minorHAnsi" w:cstheme="minorHAnsi"/>
+          <w:b/>
+          <w:bCs/>
+        </w:rPr>
+        <w:t>hooks</w:t>
+      </w:r>
+      <w:proofErr w:type="gramEnd"/>
+      <w:r>
+        <w:rPr>
+          <w:rStyle w:val="HTMLCode"/>
+          <w:rFonts w:asciiTheme="minorHAnsi" w:hAnsiTheme="minorHAnsi" w:cstheme="minorHAnsi"/>
+          <w:b/>
+          <w:bCs/>
+        </w:rPr>
+        <w:t>/</w:t>
+      </w:r>
+      <w:r>
+        <w:rPr>
+          <w:rFonts w:asciiTheme="minorHAnsi" w:hAnsiTheme="minorHAnsi" w:cstheme="minorHAnsi"/>
+        </w:rPr>
+        <w:t xml:space="preserve"> — Custom hooks like </w:t>
+      </w:r>
+      <w:proofErr w:type="spellStart"/>
+      <w:r>
+        <w:rPr>
+          <w:rStyle w:val="HTMLCode"/>
+          <w:rFonts w:asciiTheme="minorHAnsi" w:hAnsiTheme="minorHAnsi" w:cstheme="minorHAnsi"/>
+        </w:rPr>
+        <w:t>useUsers</w:t>
+      </w:r>
+      <w:proofErr w:type="spellEnd"/>
+      <w:r>
+        <w:rPr>
+          <w:rStyle w:val="HTMLCode"/>
+          <w:rFonts w:asciiTheme="minorHAnsi" w:hAnsiTheme="minorHAnsi" w:cstheme="minorHAnsi"/>
+        </w:rPr>
+        <w:t>()</w:t>
+      </w:r>
+      <w:r>
+        <w:rPr>
+          <w:rFonts w:asciiTheme="minorHAnsi" w:hAnsiTheme="minorHAnsi" w:cstheme="minorHAnsi"/>
+        </w:rPr>
+        <w:t xml:space="preserve"> call the </w:t>
+      </w:r>
+      <w:proofErr w:type="spellStart"/>
+      <w:r>
+        <w:rPr>
+          <w:rFonts w:asciiTheme="minorHAnsi" w:hAnsiTheme="minorHAnsi" w:cstheme="minorHAnsi"/>
+        </w:rPr>
+        <w:t>api</w:t>
+      </w:r>
+      <w:proofErr w:type="spellEnd"/>
+      <w:r>
+        <w:rPr>
+          <w:rFonts w:asciiTheme="minorHAnsi" w:hAnsiTheme="minorHAnsi" w:cstheme="minorHAnsi"/>
+        </w:rPr>
+        <w:t xml:space="preserve"> layer and manage the </w:t>
+      </w:r>
+      <w:proofErr w:type="spellStart"/>
+      <w:r>
+        <w:rPr>
+          <w:rFonts w:asciiTheme="minorHAnsi" w:hAnsiTheme="minorHAnsi" w:cstheme="minorHAnsi"/>
+        </w:rPr>
+        <w:t>async</w:t>
+      </w:r>
+      <w:proofErr w:type="spellEnd"/>
+      <w:r>
+        <w:rPr>
+          <w:rFonts w:asciiTheme="minorHAnsi" w:hAnsiTheme="minorHAnsi" w:cstheme="minorHAnsi"/>
+        </w:rPr>
+        <w:t xml:space="preserve"> lifecycle (loading, error, data). Your components never call </w:t>
+      </w:r>
+      <w:r>
+        <w:rPr>
+          <w:rStyle w:val="HTMLCode"/>
+          <w:rFonts w:asciiTheme="minorHAnsi" w:hAnsiTheme="minorHAnsi" w:cstheme="minorHAnsi"/>
+        </w:rPr>
+        <w:t>fetch</w:t>
+      </w:r>
+      <w:r>
+        <w:rPr>
+          <w:rFonts w:asciiTheme="minorHAnsi" w:hAnsiTheme="minorHAnsi" w:cstheme="minorHAnsi"/>
+        </w:rPr>
+        <w:t xml:space="preserve"> directly — they just consume a hook. This makes components much easier to test.</w:t>
+      </w:r>
+    </w:p>
+    <w:p>
+      <w:pPr>
+        <w:pStyle w:val="font-claude-response-body"/>
+        <w:rPr>
+          <w:rFonts w:asciiTheme="minorHAnsi" w:hAnsiTheme="minorHAnsi" w:cstheme="minorHAnsi"/>
+        </w:rPr>
+      </w:pPr>
+      <w:proofErr w:type="gramStart"/>
+      <w:r>
+        <w:rPr>
+          <w:rStyle w:val="HTMLCode"/>
+          <w:rFonts w:asciiTheme="minorHAnsi" w:hAnsiTheme="minorHAnsi" w:cstheme="minorHAnsi"/>
+          <w:b/>
+          <w:bCs/>
+        </w:rPr>
+        <w:t>pages</w:t>
+      </w:r>
+      <w:proofErr w:type="gramEnd"/>
+      <w:r>
+        <w:rPr>
+          <w:rStyle w:val="HTMLCode"/>
+          <w:rFonts w:asciiTheme="minorHAnsi" w:hAnsiTheme="minorHAnsi" w:cstheme="minorHAnsi"/>
+          <w:b/>
+          <w:bCs/>
+        </w:rPr>
+        <w:t>/</w:t>
+      </w:r>
+      <w:r>
+        <w:rPr>
+          <w:rFonts w:asciiTheme="minorHAnsi" w:hAnsiTheme="minorHAnsi" w:cstheme="minorHAnsi"/>
+        </w:rPr>
+        <w:t xml:space="preserve"> — Route-level components that wire hooks to UI. They call hooks and pass data down to dumb components. Think of them as the "orchestrators."</w:t>
+      </w:r>
+    </w:p>
+    <w:p>
+      <w:pPr>
+        <w:pStyle w:val="font-claude-response-body"/>
+        <w:rPr>
+          <w:rFonts w:asciiTheme="minorHAnsi" w:hAnsiTheme="minorHAnsi" w:cstheme="minorHAnsi"/>
+        </w:rPr>
+      </w:pPr>
+      <w:proofErr w:type="gramStart"/>
+      <w:r>
+        <w:rPr>
+          <w:rStyle w:val="HTMLCode"/>
+          <w:rFonts w:asciiTheme="minorHAnsi" w:hAnsiTheme="minorHAnsi" w:cstheme="minorHAnsi"/>
+          <w:b/>
+          <w:bCs/>
+        </w:rPr>
+        <w:t>components</w:t>
+      </w:r>
+      <w:proofErr w:type="gramEnd"/>
+      <w:r>
+        <w:rPr>
+          <w:rStyle w:val="HTMLCode"/>
+          <w:rFonts w:asciiTheme="minorHAnsi" w:hAnsiTheme="minorHAnsi" w:cstheme="minorHAnsi"/>
+          <w:b/>
+          <w:bCs/>
+        </w:rPr>
+        <w:t>/</w:t>
+      </w:r>
+      <w:r>
+        <w:rPr>
+          <w:rFonts w:asciiTheme="minorHAnsi" w:hAnsiTheme="minorHAnsi" w:cstheme="minorHAnsi"/>
+        </w:rPr>
+        <w:t xml:space="preserve"> — Purely presentational. They receive props and render UI. No </w:t>
+      </w:r>
+      <w:proofErr w:type="spellStart"/>
+      <w:r>
+        <w:rPr>
+          <w:rStyle w:val="HTMLCode"/>
+          <w:rFonts w:asciiTheme="minorHAnsi" w:hAnsiTheme="minorHAnsi" w:cstheme="minorHAnsi"/>
+        </w:rPr>
+        <w:t>useEffect</w:t>
+      </w:r>
+      <w:proofErr w:type="spellEnd"/>
+      <w:r>
+        <w:rPr>
+          <w:rFonts w:asciiTheme="minorHAnsi" w:hAnsiTheme="minorHAnsi" w:cstheme="minorHAnsi"/>
+        </w:rPr>
+        <w:t xml:space="preserve"> fetching here. If a component needs data, it should receive it as a prop from a page.</w:t>
+      </w:r>
+    </w:p>
+    <w:p>
+      <w:pPr>
+        <w:pStyle w:val="font-claude-response-body"/>
+        <w:rPr>
+          <w:rFonts w:asciiTheme="minorHAnsi" w:hAnsiTheme="minorHAnsi" w:cstheme="minorHAnsi"/>
+        </w:rPr>
+      </w:pPr>
+      <w:proofErr w:type="gramStart"/>
+      <w:r>
+        <w:rPr>
+          <w:rStyle w:val="HTMLCode"/>
+          <w:rFonts w:asciiTheme="minorHAnsi" w:hAnsiTheme="minorHAnsi" w:cstheme="minorHAnsi"/>
+          <w:b/>
+          <w:bCs/>
+        </w:rPr>
+        <w:t>context</w:t>
+      </w:r>
+      <w:proofErr w:type="gramEnd"/>
+      <w:r>
+        <w:rPr>
+          <w:rStyle w:val="HTMLCode"/>
+          <w:rFonts w:asciiTheme="minorHAnsi" w:hAnsiTheme="minorHAnsi" w:cstheme="minorHAnsi"/>
+          <w:b/>
+          <w:bCs/>
+        </w:rPr>
+        <w:t>/</w:t>
+      </w:r>
+      <w:r>
+        <w:rPr>
+          <w:rFonts w:asciiTheme="minorHAnsi" w:hAnsiTheme="minorHAnsi" w:cstheme="minorHAnsi"/>
+        </w:rPr>
+        <w:t xml:space="preserve"> — Only for truly global state like </w:t>
+      </w:r>
+      <w:proofErr w:type="spellStart"/>
+      <w:r>
+        <w:rPr>
+          <w:rFonts w:asciiTheme="minorHAnsi" w:hAnsiTheme="minorHAnsi" w:cstheme="minorHAnsi"/>
+        </w:rPr>
+        <w:t>auth</w:t>
+      </w:r>
+      <w:proofErr w:type="spellEnd"/>
+      <w:r>
+        <w:rPr>
+          <w:rFonts w:asciiTheme="minorHAnsi" w:hAnsiTheme="minorHAnsi" w:cstheme="minorHAnsi"/>
+        </w:rPr>
+        <w:t xml:space="preserve"> tokens or theme. Don't put server data here — hooks are better for that.</w:t>
+      </w:r>
+    </w:p>
+    <w:p>
+      <w:pPr>
+        <w:pStyle w:val="font-claude-response-body"/>
+        <w:rPr>
+          <w:rFonts w:asciiTheme="minorHAnsi" w:hAnsiTheme="minorHAnsi" w:cstheme="minorHAnsi"/>
+        </w:rPr>
+      </w:pPr>
+      <w:proofErr w:type="spellStart"/>
+      <w:proofErr w:type="gramStart"/>
+      <w:r>
+        <w:rPr>
+          <w:rStyle w:val="HTMLCode"/>
+          <w:rFonts w:asciiTheme="minorHAnsi" w:hAnsiTheme="minorHAnsi" w:cstheme="minorHAnsi"/>
+          <w:b/>
+          <w:bCs/>
+        </w:rPr>
+        <w:t>utils</w:t>
+      </w:r>
+      <w:proofErr w:type="spellEnd"/>
+      <w:proofErr w:type="gramEnd"/>
+      <w:r>
+        <w:rPr>
+          <w:rStyle w:val="HTMLCode"/>
+          <w:rFonts w:asciiTheme="minorHAnsi" w:hAnsiTheme="minorHAnsi" w:cstheme="minorHAnsi"/>
+          <w:b/>
+          <w:bCs/>
+        </w:rPr>
+        <w:t>/</w:t>
+      </w:r>
+      <w:r>
+        <w:rPr>
+          <w:rFonts w:asciiTheme="minorHAnsi" w:hAnsiTheme="minorHAnsi" w:cstheme="minorHAnsi"/>
+        </w:rPr>
+        <w:t xml:space="preserve"> — Pure JS functions with no React dependency. Easy to unit test in isolation.</w:t>
+      </w:r>
+    </w:p>
+    <w:p>
+      <w:pPr>
+        <w:pStyle w:val="font-claude-response-body"/>
+        <w:rPr>
+          <w:rFonts w:asciiTheme="minorHAnsi" w:hAnsiTheme="minorHAnsi" w:cstheme="minorHAnsi"/>
+        </w:rPr>
+      </w:pPr>
+      <w:r>
+        <w:rPr>
+          <w:rFonts w:asciiTheme="minorHAnsi" w:hAnsiTheme="minorHAnsi" w:cstheme="minorHAnsi"/>
+        </w:rPr>
+        <w:t xml:space="preserve">The key rule to enforce: </w:t>
+      </w:r>
+      <w:r>
+        <w:rPr>
+          <w:rStyle w:val="Strong"/>
+          <w:rFonts w:asciiTheme="minorHAnsi" w:eastAsiaTheme="majorEastAsia" w:hAnsiTheme="minorHAnsi" w:cstheme="minorHAnsi"/>
+        </w:rPr>
+        <w:t>data always flows downward</w:t>
+      </w:r>
+      <w:r>
+        <w:rPr>
+          <w:rFonts w:asciiTheme="minorHAnsi" w:hAnsiTheme="minorHAnsi" w:cstheme="minorHAnsi"/>
+        </w:rPr>
+        <w:t xml:space="preserve"> (</w:t>
+      </w:r>
+      <w:proofErr w:type="spellStart"/>
+      <w:proofErr w:type="gramStart"/>
+      <w:r>
+        <w:rPr>
+          <w:rStyle w:val="HTMLCode"/>
+          <w:rFonts w:asciiTheme="minorHAnsi" w:hAnsiTheme="minorHAnsi" w:cstheme="minorHAnsi"/>
+        </w:rPr>
+        <w:t>api</w:t>
+      </w:r>
+      <w:proofErr w:type="spellEnd"/>
+      <w:proofErr w:type="gramEnd"/>
+      <w:r>
+        <w:rPr>
+          <w:rStyle w:val="HTMLCode"/>
+          <w:rFonts w:asciiTheme="minorHAnsi" w:hAnsiTheme="minorHAnsi" w:cstheme="minorHAnsi"/>
+        </w:rPr>
+        <w:t xml:space="preserve"> → hooks → pages → components</w:t>
+      </w:r>
+      <w:r>
+        <w:rPr>
+          <w:rFonts w:asciiTheme="minorHAnsi" w:hAnsiTheme="minorHAnsi" w:cstheme="minorHAnsi"/>
+        </w:rPr>
+        <w:t>), and components never skip layers to call the API directly.</w:t>
+      </w:r>
+    </w:p>
+    <w:p>
+      <w:pPr>
+        <w:rPr>
+          <w:rStyle w:val="Hyperlink"/>
+          <w:sz w:val="28"/>
+          <w:szCs w:val="28"/>
+        </w:rPr>
+      </w:pPr>
+    </w:p>
+    <w:p>
+      <w:pPr>
+        <w:pStyle w:val="Heading1"/>
       </w:pPr>
       <w:r>
         <w:t>Deployment</w:t>
@@ -677,7 +1181,6 @@
     </w:p>
     <w:p>
       <w:r>
-        <w:lastRenderedPageBreak/>
         <w:t xml:space="preserve">1. Create </w:t>
       </w:r>
       <w:proofErr w:type="spellStart"/>
@@ -701,13 +1204,11 @@
       <w:r>
         <w:t xml:space="preserve"> your repository &gt; settings &gt; </w:t>
       </w:r>
-      <w:proofErr w:type="spellStart"/>
-      <w:r>
-        <w:t>Github</w:t>
-      </w:r>
-      <w:proofErr w:type="spellEnd"/>
-      <w:r>
-        <w:t xml:space="preserve"> pages (your repo should be public)</w:t>
+      <w:r>
+        <w:t>Pages</w:t>
+      </w:r>
+      <w:r>
+        <w:t xml:space="preserve"> (your repo should be public)</w:t>
       </w:r>
     </w:p>
     <w:p>
@@ -860,127 +1361,218 @@
       <w:r>
         <w:t xml:space="preserve"> run build"</w:t>
       </w:r>
-    </w:p>
-    <w:p>
-      <w:r>
-        <w:t>4. Go to vite.config.js and add base: "/</w:t>
-      </w:r>
-      <w:proofErr w:type="spellStart"/>
-      <w:r>
-        <w:t>reponame</w:t>
-      </w:r>
-      <w:proofErr w:type="spellEnd"/>
-      <w:r>
-        <w:t>/</w:t>
-      </w:r>
-      <w:proofErr w:type="gramStart"/>
-      <w:r>
-        <w:t>"  =</w:t>
-      </w:r>
-      <w:proofErr w:type="gramEnd"/>
-      <w:r>
-        <w:t>=&gt; after adding custom domain  value become base:"/"</w:t>
-      </w:r>
-    </w:p>
-    <w:p>
-      <w:r>
-        <w:t xml:space="preserve">5. </w:t>
-      </w:r>
-      <w:proofErr w:type="gramStart"/>
-      <w:r>
-        <w:t>in</w:t>
-      </w:r>
-      <w:proofErr w:type="gramEnd"/>
-      <w:r>
-        <w:t xml:space="preserve"> the terminal run "</w:t>
-      </w:r>
-      <w:proofErr w:type="spellStart"/>
-      <w:r>
-        <w:t>npm</w:t>
-      </w:r>
-      <w:proofErr w:type="spellEnd"/>
-      <w:r>
-        <w:t xml:space="preserve"> run deploy"</w:t>
-      </w:r>
-    </w:p>
-    <w:p>
-      <w:r>
-        <w:t xml:space="preserve">6. Now push the changes from "main" branch (refer </w:t>
-      </w:r>
-      <w:proofErr w:type="spellStart"/>
-      <w:r>
-        <w:t>static.yml</w:t>
-      </w:r>
-      <w:proofErr w:type="spellEnd"/>
-      <w:r>
-        <w:t>) it will automatically deployed</w:t>
-      </w:r>
-    </w:p>
-    <w:p/>
-    <w:p/>
-    <w:p>
-      <w:pPr>
-        <w:rPr>
-          <w:sz w:val="28"/>
-          <w:szCs w:val="28"/>
-        </w:rPr>
-      </w:pPr>
-    </w:p>
-    <w:p>
-      <w:pPr>
-        <w:pStyle w:val="Heading1"/>
-      </w:pPr>
-      <w:r>
-        <w:t>GitHub</w:t>
-      </w:r>
-    </w:p>
-    <w:p>
-      <w:pPr>
-        <w:pStyle w:val="Heading2"/>
-      </w:pPr>
-      <w:r>
-        <w:t>GitHub Rule set</w:t>
-      </w:r>
-    </w:p>
-    <w:p>
-      <w:r>
-        <w:t xml:space="preserve">Go to </w:t>
-      </w:r>
-      <w:proofErr w:type="spellStart"/>
-      <w:r>
-        <w:t>gopikrishee</w:t>
-      </w:r>
-      <w:proofErr w:type="spellEnd"/>
-      <w:r>
-        <w:t>/portfolio &gt; Settings &gt; Rule set and added Branch Restriction for main branch</w:t>
-      </w:r>
-      <w:r>
-        <w:t>.</w:t>
-      </w:r>
-    </w:p>
-    <w:p>
-      <w:r>
-        <w:t>No direct commit allowed on main branch all request should go through PR</w:t>
-      </w:r>
-    </w:p>
-    <w:p/>
-    <w:p>
-      <w:pPr>
-        <w:pStyle w:val="Heading2"/>
-      </w:pPr>
-      <w:r>
-        <w:t>Auto-assign a branch to issue</w:t>
-      </w:r>
-    </w:p>
-    <w:p>
-      <w:r>
-        <w:t>&lt;issue-number&gt;-&lt;short-description&gt;</w:t>
-      </w:r>
-      <w:r>
-        <w:t xml:space="preserve"> follow the naming convension</w:t>
-      </w:r>
+      <w:r>
+        <w:t xml:space="preserve"> and </w:t>
+      </w:r>
+      <w:r>
+        <w:t xml:space="preserve">"deploy": "main -d </w:t>
+      </w:r>
+      <w:proofErr w:type="spellStart"/>
+      <w:r>
+        <w:t>dist</w:t>
+      </w:r>
+      <w:proofErr w:type="spellEnd"/>
+      <w:r>
+        <w:t>"</w:t>
+      </w:r>
+    </w:p>
+    <w:p>
       <w:bookmarkStart w:id="0" w:name="_GoBack"/>
       <w:bookmarkEnd w:id="0"/>
+    </w:p>
+    <w:p/>
+    <w:p>
+      <w:r>
+        <w:t>4. Go to vite.config.js and add base: "/</w:t>
+      </w:r>
+      <w:proofErr w:type="spellStart"/>
+      <w:r>
+        <w:t>reponame</w:t>
+      </w:r>
+      <w:proofErr w:type="spellEnd"/>
+      <w:r>
+        <w:t>/</w:t>
+      </w:r>
+      <w:proofErr w:type="gramStart"/>
+      <w:r>
+        <w:t>"  =</w:t>
+      </w:r>
+      <w:proofErr w:type="gramEnd"/>
+      <w:r>
+        <w:t>=&gt; after adding custom domain  value become base:"/"</w:t>
+      </w:r>
+    </w:p>
+    <w:p>
+      <w:r>
+        <w:t xml:space="preserve">5. </w:t>
+      </w:r>
+      <w:proofErr w:type="gramStart"/>
+      <w:r>
+        <w:t>in</w:t>
+      </w:r>
+      <w:proofErr w:type="gramEnd"/>
+      <w:r>
+        <w:t xml:space="preserve"> the terminal run "</w:t>
+      </w:r>
+      <w:proofErr w:type="spellStart"/>
+      <w:r>
+        <w:t>npm</w:t>
+      </w:r>
+      <w:proofErr w:type="spellEnd"/>
+      <w:r>
+        <w:t xml:space="preserve"> run deploy"</w:t>
+      </w:r>
+    </w:p>
+    <w:p>
+      <w:r>
+        <w:t xml:space="preserve">6. Now push the changes from "main" branch (refer </w:t>
+      </w:r>
+      <w:proofErr w:type="spellStart"/>
+      <w:r>
+        <w:t>static.yml</w:t>
+      </w:r>
+      <w:proofErr w:type="spellEnd"/>
+      <w:r>
+        <w:t>) it will automatically deployed</w:t>
+      </w:r>
+    </w:p>
+    <w:p/>
+    <w:p>
+      <w:r>
+        <w:t xml:space="preserve">1.  </w:t>
+      </w:r>
+      <w:r>
+        <w:t xml:space="preserve">To link your domain to </w:t>
+      </w:r>
+      <w:proofErr w:type="spellStart"/>
+      <w:r>
+        <w:t>github</w:t>
+      </w:r>
+      <w:proofErr w:type="spellEnd"/>
+      <w:r>
+        <w:t>, go to profile picture &gt; settings &gt; Pages &gt; Add domain</w:t>
+      </w:r>
+      <w:r>
+        <w:t xml:space="preserve"> (verify first)</w:t>
+      </w:r>
+    </w:p>
+    <w:p>
+      <w:r>
+        <w:t xml:space="preserve">2. </w:t>
+      </w:r>
+      <w:r>
+        <w:t xml:space="preserve"> </w:t>
+      </w:r>
+    </w:p>
+    <w:p/>
+    <w:p>
+      <w:pPr>
+        <w:rPr>
+          <w:sz w:val="28"/>
+          <w:szCs w:val="28"/>
+        </w:rPr>
+      </w:pPr>
+    </w:p>
+    <w:p>
+      <w:pPr>
+        <w:pStyle w:val="Heading1"/>
+      </w:pPr>
+      <w:r>
+        <w:t>GitHub</w:t>
+      </w:r>
+    </w:p>
+    <w:p>
+      <w:pPr>
+        <w:pStyle w:val="Heading2"/>
+      </w:pPr>
+      <w:r>
+        <w:t>GitHub Rule set</w:t>
+      </w:r>
+    </w:p>
+    <w:p>
+      <w:r>
+        <w:t xml:space="preserve">Go to </w:t>
+      </w:r>
+      <w:proofErr w:type="spellStart"/>
+      <w:r>
+        <w:t>gopikrishee</w:t>
+      </w:r>
+      <w:proofErr w:type="spellEnd"/>
+      <w:r>
+        <w:t>/portfolio &gt; Settings &gt; Rule set and added Branch Restriction for main branch</w:t>
+      </w:r>
+      <w:r>
+        <w:t>.</w:t>
+      </w:r>
+    </w:p>
+    <w:p>
+      <w:r>
+        <w:t>No direct commit allowed on main branch all request should go through PR</w:t>
+      </w:r>
+    </w:p>
+    <w:p/>
+    <w:p>
+      <w:pPr>
+        <w:pStyle w:val="Heading2"/>
+      </w:pPr>
+      <w:r>
+        <w:t>Auto-assign a branch to issue</w:t>
+      </w:r>
+    </w:p>
+    <w:p>
+      <w:r>
+        <w:t xml:space="preserve">&lt;issue-number&gt;-&lt;short-description&gt; follow the naming </w:t>
+      </w:r>
+      <w:proofErr w:type="spellStart"/>
+      <w:r>
+        <w:t>convension</w:t>
+      </w:r>
+      <w:proofErr w:type="spellEnd"/>
+    </w:p>
+    <w:p/>
+    <w:p>
+      <w:pPr>
+        <w:pStyle w:val="Heading2"/>
+      </w:pPr>
+      <w:r>
+        <w:t>Project workflow</w:t>
+      </w:r>
+    </w:p>
+    <w:p>
+      <w:pPr>
+        <w:pStyle w:val="ListParagraph"/>
+        <w:numPr>
+          <w:ilvl w:val="0"/>
+          <w:numId w:val="1"/>
+        </w:numPr>
+      </w:pPr>
+      <w:r>
+        <w:t>If PR linked to an issues, automatically issue moved to in-progress</w:t>
+      </w:r>
+    </w:p>
+    <w:p>
+      <w:pPr>
+        <w:pStyle w:val="ListParagraph"/>
+        <w:numPr>
+          <w:ilvl w:val="0"/>
+          <w:numId w:val="1"/>
+        </w:numPr>
+      </w:pPr>
+      <w:r>
+        <w:t>If PR is closed, automatically issue will be moved to done</w:t>
+      </w:r>
+    </w:p>
+    <w:p>
+      <w:pPr>
+        <w:pStyle w:val="ListParagraph"/>
+        <w:numPr>
+          <w:ilvl w:val="0"/>
+          <w:numId w:val="1"/>
+        </w:numPr>
+      </w:pPr>
+      <w:r>
+        <w:t>When item added to the project, automatically moved to backlog</w:t>
+      </w:r>
     </w:p>
     <w:sectPr>
       <w:pgSz w:w="12240" w:h="15840"/>
@@ -990,6 +1582,287 @@
     </w:sectPr>
   </w:body>
 </w:document>
+</file>
+
+<file path=word/numbering.xml><?xml version="1.0" encoding="utf-8"?>
+<w:numbering xmlns:wpc="http://schemas.microsoft.com/office/word/2010/wordprocessingCanvas" xmlns:cx="http://schemas.microsoft.com/office/drawing/2014/chartex" xmlns:cx1="http://schemas.microsoft.com/office/drawing/2015/9/8/chartex" xmlns:mc="http://schemas.openxmlformats.org/markup-compatibility/2006" xmlns:o="urn:schemas-microsoft-com:office:office" xmlns:r="http://schemas.openxmlformats.org/officeDocument/2006/relationships" xmlns:m="http://schemas.openxmlformats.org/officeDocument/2006/math" xmlns:v="urn:schemas-microsoft-com:vml" xmlns:wp14="http://schemas.microsoft.com/office/word/2010/wordprocessingDrawing" xmlns:wp="http://schemas.openxmlformats.org/drawingml/2006/wordprocessingDrawing" xmlns:w10="urn:schemas-microsoft-com:office:word" xmlns:w="http://schemas.openxmlformats.org/wordprocessingml/2006/main" xmlns:w14="http://schemas.microsoft.com/office/word/2010/wordml" xmlns:w15="http://schemas.microsoft.com/office/word/2012/wordml" xmlns:w16se="http://schemas.microsoft.com/office/word/2015/wordml/symex" xmlns:wpg="http://schemas.microsoft.com/office/word/2010/wordprocessingGroup" xmlns:wpi="http://schemas.microsoft.com/office/word/2010/wordprocessingInk" xmlns:wne="http://schemas.microsoft.com/office/word/2006/wordml" xmlns:wps="http://schemas.microsoft.com/office/word/2010/wordprocessingShape" mc:Ignorable="w14 w15 w16se wp14">
+  <w:abstractNum w:abstractNumId="0" w15:restartNumberingAfterBreak="0">
+    <w:nsid w:val="5F417A43"/>
+    <w:multiLevelType w:val="hybridMultilevel"/>
+    <w:tmpl w:val="19D8C062"/>
+    <w:lvl w:ilvl="0" w:tplc="0409000F">
+      <w:start w:val="1"/>
+      <w:numFmt w:val="decimal"/>
+      <w:lvlText w:val="%1."/>
+      <w:lvlJc w:val="left"/>
+      <w:pPr>
+        <w:ind w:left="720" w:hanging="360"/>
+      </w:pPr>
+      <w:rPr>
+        <w:rFonts w:hint="default"/>
+      </w:rPr>
+    </w:lvl>
+    <w:lvl w:ilvl="1" w:tplc="04090019" w:tentative="1">
+      <w:start w:val="1"/>
+      <w:numFmt w:val="lowerLetter"/>
+      <w:lvlText w:val="%2."/>
+      <w:lvlJc w:val="left"/>
+      <w:pPr>
+        <w:ind w:left="1440" w:hanging="360"/>
+      </w:pPr>
+    </w:lvl>
+    <w:lvl w:ilvl="2" w:tplc="0409001B" w:tentative="1">
+      <w:start w:val="1"/>
+      <w:numFmt w:val="lowerRoman"/>
+      <w:lvlText w:val="%3."/>
+      <w:lvlJc w:val="right"/>
+      <w:pPr>
+        <w:ind w:left="2160" w:hanging="180"/>
+      </w:pPr>
+    </w:lvl>
+    <w:lvl w:ilvl="3" w:tplc="0409000F" w:tentative="1">
+      <w:start w:val="1"/>
+      <w:numFmt w:val="decimal"/>
+      <w:lvlText w:val="%4."/>
+      <w:lvlJc w:val="left"/>
+      <w:pPr>
+        <w:ind w:left="2880" w:hanging="360"/>
+      </w:pPr>
+    </w:lvl>
+    <w:lvl w:ilvl="4" w:tplc="04090019" w:tentative="1">
+      <w:start w:val="1"/>
+      <w:numFmt w:val="lowerLetter"/>
+      <w:lvlText w:val="%5."/>
+      <w:lvlJc w:val="left"/>
+      <w:pPr>
+        <w:ind w:left="3600" w:hanging="360"/>
+      </w:pPr>
+    </w:lvl>
+    <w:lvl w:ilvl="5" w:tplc="0409001B" w:tentative="1">
+      <w:start w:val="1"/>
+      <w:numFmt w:val="lowerRoman"/>
+      <w:lvlText w:val="%6."/>
+      <w:lvlJc w:val="right"/>
+      <w:pPr>
+        <w:ind w:left="4320" w:hanging="180"/>
+      </w:pPr>
+    </w:lvl>
+    <w:lvl w:ilvl="6" w:tplc="0409000F" w:tentative="1">
+      <w:start w:val="1"/>
+      <w:numFmt w:val="decimal"/>
+      <w:lvlText w:val="%7."/>
+      <w:lvlJc w:val="left"/>
+      <w:pPr>
+        <w:ind w:left="5040" w:hanging="360"/>
+      </w:pPr>
+    </w:lvl>
+    <w:lvl w:ilvl="7" w:tplc="04090019" w:tentative="1">
+      <w:start w:val="1"/>
+      <w:numFmt w:val="lowerLetter"/>
+      <w:lvlText w:val="%8."/>
+      <w:lvlJc w:val="left"/>
+      <w:pPr>
+        <w:ind w:left="5760" w:hanging="360"/>
+      </w:pPr>
+    </w:lvl>
+    <w:lvl w:ilvl="8" w:tplc="0409001B" w:tentative="1">
+      <w:start w:val="1"/>
+      <w:numFmt w:val="lowerRoman"/>
+      <w:lvlText w:val="%9."/>
+      <w:lvlJc w:val="right"/>
+      <w:pPr>
+        <w:ind w:left="6480" w:hanging="180"/>
+      </w:pPr>
+    </w:lvl>
+  </w:abstractNum>
+  <w:abstractNum w:abstractNumId="1" w15:restartNumberingAfterBreak="0">
+    <w:nsid w:val="6F530CE4"/>
+    <w:multiLevelType w:val="hybridMultilevel"/>
+    <w:tmpl w:val="F8B028F4"/>
+    <w:lvl w:ilvl="0" w:tplc="0409000F">
+      <w:start w:val="1"/>
+      <w:numFmt w:val="decimal"/>
+      <w:lvlText w:val="%1."/>
+      <w:lvlJc w:val="left"/>
+      <w:pPr>
+        <w:ind w:left="720" w:hanging="360"/>
+      </w:pPr>
+      <w:rPr>
+        <w:rFonts w:hint="default"/>
+      </w:rPr>
+    </w:lvl>
+    <w:lvl w:ilvl="1" w:tplc="04090019" w:tentative="1">
+      <w:start w:val="1"/>
+      <w:numFmt w:val="lowerLetter"/>
+      <w:lvlText w:val="%2."/>
+      <w:lvlJc w:val="left"/>
+      <w:pPr>
+        <w:ind w:left="1440" w:hanging="360"/>
+      </w:pPr>
+    </w:lvl>
+    <w:lvl w:ilvl="2" w:tplc="0409001B" w:tentative="1">
+      <w:start w:val="1"/>
+      <w:numFmt w:val="lowerRoman"/>
+      <w:lvlText w:val="%3."/>
+      <w:lvlJc w:val="right"/>
+      <w:pPr>
+        <w:ind w:left="2160" w:hanging="180"/>
+      </w:pPr>
+    </w:lvl>
+    <w:lvl w:ilvl="3" w:tplc="0409000F" w:tentative="1">
+      <w:start w:val="1"/>
+      <w:numFmt w:val="decimal"/>
+      <w:lvlText w:val="%4."/>
+      <w:lvlJc w:val="left"/>
+      <w:pPr>
+        <w:ind w:left="2880" w:hanging="360"/>
+      </w:pPr>
+    </w:lvl>
+    <w:lvl w:ilvl="4" w:tplc="04090019" w:tentative="1">
+      <w:start w:val="1"/>
+      <w:numFmt w:val="lowerLetter"/>
+      <w:lvlText w:val="%5."/>
+      <w:lvlJc w:val="left"/>
+      <w:pPr>
+        <w:ind w:left="3600" w:hanging="360"/>
+      </w:pPr>
+    </w:lvl>
+    <w:lvl w:ilvl="5" w:tplc="0409001B" w:tentative="1">
+      <w:start w:val="1"/>
+      <w:numFmt w:val="lowerRoman"/>
+      <w:lvlText w:val="%6."/>
+      <w:lvlJc w:val="right"/>
+      <w:pPr>
+        <w:ind w:left="4320" w:hanging="180"/>
+      </w:pPr>
+    </w:lvl>
+    <w:lvl w:ilvl="6" w:tplc="0409000F" w:tentative="1">
+      <w:start w:val="1"/>
+      <w:numFmt w:val="decimal"/>
+      <w:lvlText w:val="%7."/>
+      <w:lvlJc w:val="left"/>
+      <w:pPr>
+        <w:ind w:left="5040" w:hanging="360"/>
+      </w:pPr>
+    </w:lvl>
+    <w:lvl w:ilvl="7" w:tplc="04090019" w:tentative="1">
+      <w:start w:val="1"/>
+      <w:numFmt w:val="lowerLetter"/>
+      <w:lvlText w:val="%8."/>
+      <w:lvlJc w:val="left"/>
+      <w:pPr>
+        <w:ind w:left="5760" w:hanging="360"/>
+      </w:pPr>
+    </w:lvl>
+    <w:lvl w:ilvl="8" w:tplc="0409001B" w:tentative="1">
+      <w:start w:val="1"/>
+      <w:numFmt w:val="lowerRoman"/>
+      <w:lvlText w:val="%9."/>
+      <w:lvlJc w:val="right"/>
+      <w:pPr>
+        <w:ind w:left="6480" w:hanging="180"/>
+      </w:pPr>
+    </w:lvl>
+  </w:abstractNum>
+  <w:abstractNum w:abstractNumId="2" w15:restartNumberingAfterBreak="0">
+    <w:nsid w:val="7C772EC6"/>
+    <w:multiLevelType w:val="hybridMultilevel"/>
+    <w:tmpl w:val="2A485514"/>
+    <w:lvl w:ilvl="0" w:tplc="0409000F">
+      <w:start w:val="1"/>
+      <w:numFmt w:val="decimal"/>
+      <w:lvlText w:val="%1."/>
+      <w:lvlJc w:val="left"/>
+      <w:pPr>
+        <w:ind w:left="720" w:hanging="360"/>
+      </w:pPr>
+      <w:rPr>
+        <w:rFonts w:hint="default"/>
+      </w:rPr>
+    </w:lvl>
+    <w:lvl w:ilvl="1" w:tplc="04090019" w:tentative="1">
+      <w:start w:val="1"/>
+      <w:numFmt w:val="lowerLetter"/>
+      <w:lvlText w:val="%2."/>
+      <w:lvlJc w:val="left"/>
+      <w:pPr>
+        <w:ind w:left="1440" w:hanging="360"/>
+      </w:pPr>
+    </w:lvl>
+    <w:lvl w:ilvl="2" w:tplc="0409001B" w:tentative="1">
+      <w:start w:val="1"/>
+      <w:numFmt w:val="lowerRoman"/>
+      <w:lvlText w:val="%3."/>
+      <w:lvlJc w:val="right"/>
+      <w:pPr>
+        <w:ind w:left="2160" w:hanging="180"/>
+      </w:pPr>
+    </w:lvl>
+    <w:lvl w:ilvl="3" w:tplc="0409000F" w:tentative="1">
+      <w:start w:val="1"/>
+      <w:numFmt w:val="decimal"/>
+      <w:lvlText w:val="%4."/>
+      <w:lvlJc w:val="left"/>
+      <w:pPr>
+        <w:ind w:left="2880" w:hanging="360"/>
+      </w:pPr>
+    </w:lvl>
+    <w:lvl w:ilvl="4" w:tplc="04090019" w:tentative="1">
+      <w:start w:val="1"/>
+      <w:numFmt w:val="lowerLetter"/>
+      <w:lvlText w:val="%5."/>
+      <w:lvlJc w:val="left"/>
+      <w:pPr>
+        <w:ind w:left="3600" w:hanging="360"/>
+      </w:pPr>
+    </w:lvl>
+    <w:lvl w:ilvl="5" w:tplc="0409001B" w:tentative="1">
+      <w:start w:val="1"/>
+      <w:numFmt w:val="lowerRoman"/>
+      <w:lvlText w:val="%6."/>
+      <w:lvlJc w:val="right"/>
+      <w:pPr>
+        <w:ind w:left="4320" w:hanging="180"/>
+      </w:pPr>
+    </w:lvl>
+    <w:lvl w:ilvl="6" w:tplc="0409000F" w:tentative="1">
+      <w:start w:val="1"/>
+      <w:numFmt w:val="decimal"/>
+      <w:lvlText w:val="%7."/>
+      <w:lvlJc w:val="left"/>
+      <w:pPr>
+        <w:ind w:left="5040" w:hanging="360"/>
+      </w:pPr>
+    </w:lvl>
+    <w:lvl w:ilvl="7" w:tplc="04090019" w:tentative="1">
+      <w:start w:val="1"/>
+      <w:numFmt w:val="lowerLetter"/>
+      <w:lvlText w:val="%8."/>
+      <w:lvlJc w:val="left"/>
+      <w:pPr>
+        <w:ind w:left="5760" w:hanging="360"/>
+      </w:pPr>
+    </w:lvl>
+    <w:lvl w:ilvl="8" w:tplc="0409001B" w:tentative="1">
+      <w:start w:val="1"/>
+      <w:numFmt w:val="lowerRoman"/>
+      <w:lvlText w:val="%9."/>
+      <w:lvlJc w:val="right"/>
+      <w:pPr>
+        <w:ind w:left="6480" w:hanging="180"/>
+      </w:pPr>
+    </w:lvl>
+  </w:abstractNum>
+  <w:num w:numId="1">
+    <w:abstractNumId w:val="1"/>
+  </w:num>
+  <w:num w:numId="2">
+    <w:abstractNumId w:val="2"/>
+  </w:num>
+  <w:num w:numId="3">
+    <w:abstractNumId w:val="0"/>
+  </w:num>
+</w:numbering>
 </file>
 
 <file path=word/styles.xml><?xml version="1.0" encoding="utf-8"?>
@@ -1432,7 +2305,6 @@
   <w:style w:type="character" w:default="1" w:styleId="DefaultParagraphFont">
     <w:name w:val="Default Paragraph Font"/>
     <w:uiPriority w:val="1"/>
-    <w:semiHidden/>
     <w:unhideWhenUsed/>
   </w:style>
   <w:style w:type="table" w:default="1" w:styleId="TableNormal">
@@ -1491,6 +2363,54 @@
       <w:color w:val="2E74B5" w:themeColor="accent1" w:themeShade="BF"/>
       <w:sz w:val="26"/>
       <w:szCs w:val="26"/>
+    </w:rPr>
+  </w:style>
+  <w:style w:type="paragraph" w:styleId="ListParagraph">
+    <w:name w:val="List Paragraph"/>
+    <w:basedOn w:val="Normal"/>
+    <w:uiPriority w:val="34"/>
+    <w:qFormat/>
+    <w:rsid w:val="004F0320"/>
+    <w:pPr>
+      <w:ind w:left="720"/>
+      <w:contextualSpacing/>
+    </w:pPr>
+  </w:style>
+  <w:style w:type="paragraph" w:customStyle="1" w:styleId="font-claude-response-body">
+    <w:name w:val="font-claude-response-body"/>
+    <w:basedOn w:val="Normal"/>
+    <w:rsid w:val="00C178C1"/>
+    <w:pPr>
+      <w:spacing w:before="100" w:beforeAutospacing="1" w:after="100" w:afterAutospacing="1" w:line="240" w:lineRule="auto"/>
+    </w:pPr>
+    <w:rPr>
+      <w:rFonts w:ascii="Times New Roman" w:eastAsia="Times New Roman" w:hAnsi="Times New Roman" w:cs="Times New Roman"/>
+      <w:sz w:val="24"/>
+      <w:szCs w:val="24"/>
+    </w:rPr>
+  </w:style>
+  <w:style w:type="character" w:styleId="Strong">
+    <w:name w:val="Strong"/>
+    <w:basedOn w:val="DefaultParagraphFont"/>
+    <w:uiPriority w:val="22"/>
+    <w:qFormat/>
+    <w:rsid w:val="00C178C1"/>
+    <w:rPr>
+      <w:b/>
+      <w:bCs/>
+    </w:rPr>
+  </w:style>
+  <w:style w:type="character" w:styleId="HTMLCode">
+    <w:name w:val="HTML Code"/>
+    <w:basedOn w:val="DefaultParagraphFont"/>
+    <w:uiPriority w:val="99"/>
+    <w:semiHidden/>
+    <w:unhideWhenUsed/>
+    <w:rsid w:val="00C178C1"/>
+    <w:rPr>
+      <w:rFonts w:ascii="Courier New" w:eastAsia="Times New Roman" w:hAnsi="Courier New" w:cs="Courier New"/>
+      <w:sz w:val="20"/>
+      <w:szCs w:val="20"/>
     </w:rPr>
   </w:style>
 </w:styles>

</xml_diff>